<commit_message>
Split report equations so Word shows each formula on its own line.
The aligned environment does not render in Markdown preview or in Word body text.

Co-authored-by: Tryrail4510471 <Tryrail4510471@users.noreply.github.com>
</commit_message>
<xml_diff>
--- a/paper/midterm_section2_progress.docx
+++ b/paper/midterm_section2_progress.docx
@@ -674,234 +674,202 @@
           <m:jc m:val="center"/>
         </m:oMathParaPr>
         <m:oMath>
-          <m:m>
-            <m:mPr>
-              <m:baseJc m:val="center"/>
-              <m:plcHide m:val="on"/>
-              <m:mcs>
-                <m:mc>
-                  <m:mcPr>
-                    <m:mcJc m:val="right"/>
-                    <m:count m:val="1"/>
-                  </m:mcPr>
-                </m:mc>
-                <m:mc>
-                  <m:mcPr>
-                    <m:mcJc m:val="left"/>
-                    <m:count m:val="1"/>
-                  </m:mcPr>
-                </m:mc>
-              </m:mcs>
-            </m:mPr>
-            <m:mr>
-              <m:e>
-                <m:r>
-                  <m:rPr>
-                    <m:sty m:val="b"/>
-                  </m:rPr>
-                  <m:t>y</m:t>
-                </m:r>
-              </m:e>
-              <m:e>
-                <m:r>
-                  <m:rPr>
-                    <m:sty m:val="p"/>
-                  </m:rPr>
-                  <m:t>=</m:t>
-                </m:r>
-                <m:sSub>
-                  <m:e>
-                    <m:r>
-                      <m:rPr>
-                        <m:sty m:val="p"/>
-                      </m:rPr>
-                      <m:t>L</m:t>
-                    </m:r>
-                    <m:r>
-                      <m:rPr>
-                        <m:sty m:val="p"/>
-                      </m:rPr>
-                      <m:t>N</m:t>
-                    </m:r>
-                  </m:e>
-                  <m:sub>
-                    <m:r>
-                      <m:t>1</m:t>
-                    </m:r>
-                  </m:sub>
-                </m:sSub>
-                <m:d>
-                  <m:dPr>
-                    <m:begChr m:val="("/>
-                    <m:endChr m:val=")"/>
-                    <m:sepChr m:val=""/>
-                    <m:grow/>
-                  </m:dPr>
-                  <m:e>
-                    <m:r>
-                      <m:rPr>
-                        <m:sty m:val="b"/>
-                      </m:rPr>
-                      <m:t>x</m:t>
-                    </m:r>
-                    <m:r>
-                      <m:rPr>
-                        <m:sty m:val="p"/>
-                      </m:rPr>
-                      <m:t>+</m:t>
-                    </m:r>
-                    <m:r>
-                      <m:rPr>
-                        <m:sty m:val="p"/>
-                      </m:rPr>
-                      <m:t>A</m:t>
-                    </m:r>
-                    <m:r>
-                      <m:rPr>
-                        <m:sty m:val="p"/>
-                      </m:rPr>
-                      <m:t>t</m:t>
-                    </m:r>
-                    <m:r>
-                      <m:rPr>
-                        <m:sty m:val="p"/>
-                      </m:rPr>
-                      <m:t>t</m:t>
-                    </m:r>
-                    <m:r>
-                      <m:rPr>
-                        <m:sty m:val="p"/>
-                      </m:rPr>
-                      <m:t>n</m:t>
-                    </m:r>
-                    <m:d>
-                      <m:dPr>
-                        <m:begChr m:val="("/>
-                        <m:endChr m:val=")"/>
-                        <m:sepChr m:val=""/>
-                        <m:grow/>
-                      </m:dPr>
-                      <m:e>
-                        <m:r>
-                          <m:rPr>
-                            <m:sty m:val="b"/>
-                          </m:rPr>
-                          <m:t>x</m:t>
-                        </m:r>
-                      </m:e>
-                    </m:d>
-                  </m:e>
-                </m:d>
-                <m:r>
-                  <m:rPr>
-                    <m:sty m:val="p"/>
-                  </m:rPr>
-                  <m:t>,</m:t>
-                </m:r>
-              </m:e>
-            </m:mr>
-            <m:mr>
-              <m:e>
-                <m:r>
-                  <m:rPr>
-                    <m:sty m:val="b"/>
-                  </m:rPr>
-                  <m:t>z</m:t>
-                </m:r>
-              </m:e>
-              <m:e>
-                <m:r>
-                  <m:rPr>
-                    <m:sty m:val="p"/>
-                  </m:rPr>
-                  <m:t>=</m:t>
-                </m:r>
-                <m:sSub>
-                  <m:e>
-                    <m:r>
-                      <m:rPr>
-                        <m:sty m:val="p"/>
-                      </m:rPr>
-                      <m:t>L</m:t>
-                    </m:r>
-                    <m:r>
-                      <m:rPr>
-                        <m:sty m:val="p"/>
-                      </m:rPr>
-                      <m:t>N</m:t>
-                    </m:r>
-                  </m:e>
-                  <m:sub>
-                    <m:r>
-                      <m:t>2</m:t>
-                    </m:r>
-                  </m:sub>
-                </m:sSub>
-                <m:d>
-                  <m:dPr>
-                    <m:begChr m:val="("/>
-                    <m:endChr m:val=")"/>
-                    <m:sepChr m:val=""/>
-                    <m:grow/>
-                  </m:dPr>
-                  <m:e>
-                    <m:r>
-                      <m:rPr>
-                        <m:sty m:val="b"/>
-                      </m:rPr>
-                      <m:t>y</m:t>
-                    </m:r>
-                    <m:r>
-                      <m:rPr>
-                        <m:sty m:val="p"/>
-                      </m:rPr>
-                      <m:t>+</m:t>
-                    </m:r>
-                    <m:r>
-                      <m:rPr>
-                        <m:sty m:val="p"/>
-                      </m:rPr>
-                      <m:t>F</m:t>
-                    </m:r>
-                    <m:r>
-                      <m:rPr>
-                        <m:sty m:val="p"/>
-                      </m:rPr>
-                      <m:t>F</m:t>
-                    </m:r>
-                    <m:r>
-                      <m:rPr>
-                        <m:sty m:val="p"/>
-                      </m:rPr>
-                      <m:t>N</m:t>
-                    </m:r>
-                    <m:d>
-                      <m:dPr>
-                        <m:begChr m:val="("/>
-                        <m:endChr m:val=")"/>
-                        <m:sepChr m:val=""/>
-                        <m:grow/>
-                      </m:dPr>
-                      <m:e>
-                        <m:r>
-                          <m:rPr>
-                            <m:sty m:val="b"/>
-                          </m:rPr>
-                          <m:t>y</m:t>
-                        </m:r>
-                      </m:e>
-                    </m:d>
-                  </m:e>
-                </m:d>
-                <m:r>
-                  <m:rPr>
-                    <m:sty m:val="p"/>
-                  </m:rPr>
-                  <m:t>.</m:t>
-                </m:r>
-              </m:e>
-            </m:mr>
-          </m:m>
+          <m:r>
+            <m:rPr>
+              <m:sty m:val="b"/>
+            </m:rPr>
+            <m:t>y</m:t>
+          </m:r>
+          <m:r>
+            <m:rPr>
+              <m:sty m:val="p"/>
+            </m:rPr>
+            <m:t>=</m:t>
+          </m:r>
+          <m:sSub>
+            <m:e>
+              <m:r>
+                <m:rPr>
+                  <m:sty m:val="p"/>
+                </m:rPr>
+                <m:t>L</m:t>
+              </m:r>
+              <m:r>
+                <m:rPr>
+                  <m:sty m:val="p"/>
+                </m:rPr>
+                <m:t>N</m:t>
+              </m:r>
+            </m:e>
+            <m:sub>
+              <m:r>
+                <m:t>1</m:t>
+              </m:r>
+            </m:sub>
+          </m:sSub>
+          <m:d>
+            <m:dPr>
+              <m:begChr m:val="("/>
+              <m:endChr m:val=")"/>
+              <m:sepChr m:val=""/>
+              <m:grow/>
+            </m:dPr>
+            <m:e>
+              <m:r>
+                <m:rPr>
+                  <m:sty m:val="b"/>
+                </m:rPr>
+                <m:t>x</m:t>
+              </m:r>
+              <m:r>
+                <m:rPr>
+                  <m:sty m:val="p"/>
+                </m:rPr>
+                <m:t>+</m:t>
+              </m:r>
+              <m:r>
+                <m:rPr>
+                  <m:sty m:val="p"/>
+                </m:rPr>
+                <m:t>A</m:t>
+              </m:r>
+              <m:r>
+                <m:rPr>
+                  <m:sty m:val="p"/>
+                </m:rPr>
+                <m:t>t</m:t>
+              </m:r>
+              <m:r>
+                <m:rPr>
+                  <m:sty m:val="p"/>
+                </m:rPr>
+                <m:t>t</m:t>
+              </m:r>
+              <m:r>
+                <m:rPr>
+                  <m:sty m:val="p"/>
+                </m:rPr>
+                <m:t>n</m:t>
+              </m:r>
+              <m:d>
+                <m:dPr>
+                  <m:begChr m:val="("/>
+                  <m:endChr m:val=")"/>
+                  <m:sepChr m:val=""/>
+                  <m:grow/>
+                </m:dPr>
+                <m:e>
+                  <m:r>
+                    <m:rPr>
+                      <m:sty m:val="b"/>
+                    </m:rPr>
+                    <m:t>x</m:t>
+                  </m:r>
+                </m:e>
+              </m:d>
+            </m:e>
+          </m:d>
+        </m:oMath>
+      </m:oMathPara>
+    </w:p>
+    <w:p>
+      <w:pPr>
+        <w:pStyle w:val="FirstParagraph"/>
+      </w:pPr>
+      <m:oMathPara>
+        <m:oMathParaPr>
+          <m:jc m:val="center"/>
+        </m:oMathParaPr>
+        <m:oMath>
+          <m:r>
+            <m:rPr>
+              <m:sty m:val="b"/>
+            </m:rPr>
+            <m:t>z</m:t>
+          </m:r>
+          <m:r>
+            <m:rPr>
+              <m:sty m:val="p"/>
+            </m:rPr>
+            <m:t>=</m:t>
+          </m:r>
+          <m:sSub>
+            <m:e>
+              <m:r>
+                <m:rPr>
+                  <m:sty m:val="p"/>
+                </m:rPr>
+                <m:t>L</m:t>
+              </m:r>
+              <m:r>
+                <m:rPr>
+                  <m:sty m:val="p"/>
+                </m:rPr>
+                <m:t>N</m:t>
+              </m:r>
+            </m:e>
+            <m:sub>
+              <m:r>
+                <m:t>2</m:t>
+              </m:r>
+            </m:sub>
+          </m:sSub>
+          <m:d>
+            <m:dPr>
+              <m:begChr m:val="("/>
+              <m:endChr m:val=")"/>
+              <m:sepChr m:val=""/>
+              <m:grow/>
+            </m:dPr>
+            <m:e>
+              <m:r>
+                <m:rPr>
+                  <m:sty m:val="b"/>
+                </m:rPr>
+                <m:t>y</m:t>
+              </m:r>
+              <m:r>
+                <m:rPr>
+                  <m:sty m:val="p"/>
+                </m:rPr>
+                <m:t>+</m:t>
+              </m:r>
+              <m:r>
+                <m:rPr>
+                  <m:sty m:val="p"/>
+                </m:rPr>
+                <m:t>F</m:t>
+              </m:r>
+              <m:r>
+                <m:rPr>
+                  <m:sty m:val="p"/>
+                </m:rPr>
+                <m:t>F</m:t>
+              </m:r>
+              <m:r>
+                <m:rPr>
+                  <m:sty m:val="p"/>
+                </m:rPr>
+                <m:t>N</m:t>
+              </m:r>
+              <m:d>
+                <m:dPr>
+                  <m:begChr m:val="("/>
+                  <m:endChr m:val=")"/>
+                  <m:sepChr m:val=""/>
+                  <m:grow/>
+                </m:dPr>
+                <m:e>
+                  <m:r>
+                    <m:rPr>
+                      <m:sty m:val="b"/>
+                    </m:rPr>
+                    <m:t>y</m:t>
+                  </m:r>
+                </m:e>
+              </m:d>
+            </m:e>
+          </m:d>
         </m:oMath>
       </m:oMathPara>
     </w:p>
@@ -1346,396 +1314,364 @@
           <m:jc m:val="center"/>
         </m:oMathParaPr>
         <m:oMath>
-          <m:m>
-            <m:mPr>
-              <m:baseJc m:val="center"/>
-              <m:plcHide m:val="on"/>
-              <m:mcs>
-                <m:mc>
-                  <m:mcPr>
-                    <m:mcJc m:val="right"/>
-                    <m:count m:val="1"/>
-                  </m:mcPr>
-                </m:mc>
-                <m:mc>
-                  <m:mcPr>
-                    <m:mcJc m:val="left"/>
-                    <m:count m:val="1"/>
-                  </m:mcPr>
-                </m:mc>
-              </m:mcs>
-            </m:mPr>
-            <m:mr>
-              <m:e>
-                <m:sSub>
-                  <m:e>
-                    <m:r>
-                      <m:t>μ</m:t>
-                    </m:r>
-                  </m:e>
-                  <m:sub>
-                    <m:r>
-                      <m:t>p</m:t>
-                    </m:r>
-                  </m:sub>
-                </m:sSub>
-              </m:e>
-              <m:e>
-                <m:r>
-                  <m:rPr>
-                    <m:sty m:val="p"/>
-                  </m:rPr>
-                  <m:t>=</m:t>
-                </m:r>
-                <m:f>
-                  <m:fPr>
-                    <m:type m:val="bar"/>
-                  </m:fPr>
-                  <m:num>
-                    <m:r>
-                      <m:t>1</m:t>
-                    </m:r>
-                  </m:num>
-                  <m:den>
-                    <m:r>
-                      <m:t>768</m:t>
-                    </m:r>
-                  </m:den>
-                </m:f>
-                <m:nary>
-                  <m:naryPr>
-                    <m:chr m:val="∑"/>
-                    <m:limLoc m:val="undOvr"/>
-                    <m:subHide m:val="off"/>
-                    <m:supHide m:val="off"/>
-                  </m:naryPr>
-                  <m:sub>
-                    <m:r>
-                      <m:t>j</m:t>
-                    </m:r>
-                    <m:r>
-                      <m:rPr>
-                        <m:sty m:val="p"/>
-                      </m:rPr>
-                      <m:t>=</m:t>
-                    </m:r>
-                    <m:r>
-                      <m:t>1</m:t>
-                    </m:r>
-                  </m:sub>
-                  <m:sup>
-                    <m:r>
-                      <m:t>768</m:t>
-                    </m:r>
-                  </m:sup>
-                  <m:e>
-                    <m:sSub>
-                      <m:e>
-                        <m:r>
-                          <m:t>u</m:t>
-                        </m:r>
-                      </m:e>
-                      <m:sub>
-                        <m:r>
-                          <m:t>p</m:t>
-                        </m:r>
-                        <m:r>
-                          <m:rPr>
-                            <m:sty m:val="p"/>
-                          </m:rPr>
-                          <m:t>,</m:t>
-                        </m:r>
-                        <m:r>
-                          <m:t>j</m:t>
-                        </m:r>
-                      </m:sub>
-                    </m:sSub>
-                  </m:e>
-                </m:nary>
-                <m:r>
-                  <m:rPr>
-                    <m:sty m:val="p"/>
-                  </m:rPr>
-                  <m:t>,</m:t>
-                </m:r>
-              </m:e>
-            </m:mr>
-            <m:mr>
-              <m:e>
-                <m:sSub>
-                  <m:e>
-                    <m:r>
-                      <m:t>v</m:t>
-                    </m:r>
-                  </m:e>
-                  <m:sub>
-                    <m:r>
-                      <m:t>p</m:t>
-                    </m:r>
-                  </m:sub>
-                </m:sSub>
-              </m:e>
-              <m:e>
-                <m:r>
-                  <m:rPr>
-                    <m:sty m:val="p"/>
-                  </m:rPr>
-                  <m:t>=</m:t>
-                </m:r>
-                <m:f>
-                  <m:fPr>
-                    <m:type m:val="bar"/>
-                  </m:fPr>
-                  <m:num>
-                    <m:r>
-                      <m:t>1</m:t>
-                    </m:r>
-                  </m:num>
-                  <m:den>
-                    <m:r>
-                      <m:t>768</m:t>
-                    </m:r>
-                  </m:den>
-                </m:f>
-                <m:nary>
-                  <m:naryPr>
-                    <m:chr m:val="∑"/>
-                    <m:limLoc m:val="undOvr"/>
-                    <m:subHide m:val="off"/>
-                    <m:supHide m:val="off"/>
-                  </m:naryPr>
-                  <m:sub>
-                    <m:r>
-                      <m:t>j</m:t>
-                    </m:r>
-                    <m:r>
-                      <m:rPr>
-                        <m:sty m:val="p"/>
-                      </m:rPr>
-                      <m:t>=</m:t>
-                    </m:r>
-                    <m:r>
-                      <m:t>1</m:t>
-                    </m:r>
-                  </m:sub>
-                  <m:sup>
-                    <m:r>
-                      <m:t>768</m:t>
-                    </m:r>
-                  </m:sup>
-                  <m:e>
-                    <m:sSubSup>
-                      <m:e>
-                        <m:r>
-                          <m:t>u</m:t>
-                        </m:r>
-                      </m:e>
-                      <m:sub>
-                        <m:r>
-                          <m:t>p</m:t>
-                        </m:r>
-                        <m:r>
-                          <m:rPr>
-                            <m:sty m:val="p"/>
-                          </m:rPr>
-                          <m:t>,</m:t>
-                        </m:r>
-                        <m:r>
-                          <m:t>j</m:t>
-                        </m:r>
-                      </m:sub>
-                      <m:sup>
-                        <m:r>
-                          <m:t>2</m:t>
-                        </m:r>
-                      </m:sup>
-                    </m:sSubSup>
-                  </m:e>
-                </m:nary>
-                <m:r>
-                  <m:rPr>
-                    <m:sty m:val="p"/>
-                  </m:rPr>
-                  <m:t>−</m:t>
-                </m:r>
-                <m:sSubSup>
-                  <m:e>
-                    <m:r>
-                      <m:t>μ</m:t>
-                    </m:r>
-                  </m:e>
-                  <m:sub>
-                    <m:r>
-                      <m:t>p</m:t>
-                    </m:r>
-                  </m:sub>
-                  <m:sup>
-                    <m:r>
-                      <m:t>2</m:t>
-                    </m:r>
-                  </m:sup>
-                </m:sSubSup>
-                <m:r>
-                  <m:rPr>
-                    <m:sty m:val="p"/>
-                  </m:rPr>
-                  <m:t>,</m:t>
-                </m:r>
-              </m:e>
-            </m:mr>
-            <m:mr>
-              <m:e>
-                <m:sSub>
-                  <m:e>
-                    <m:r>
-                      <m:t>h</m:t>
-                    </m:r>
-                  </m:e>
-                  <m:sub>
-                    <m:r>
-                      <m:t>p</m:t>
-                    </m:r>
-                    <m:r>
-                      <m:rPr>
-                        <m:sty m:val="p"/>
-                      </m:rPr>
-                      <m:t>,</m:t>
-                    </m:r>
-                    <m:r>
-                      <m:t>j</m:t>
-                    </m:r>
-                  </m:sub>
-                </m:sSub>
-              </m:e>
-              <m:e>
-                <m:r>
-                  <m:rPr>
-                    <m:sty m:val="p"/>
-                  </m:rPr>
-                  <m:t>=</m:t>
-                </m:r>
-                <m:sSub>
-                  <m:e>
-                    <m:r>
-                      <m:t>γ</m:t>
-                    </m:r>
-                  </m:e>
-                  <m:sub>
-                    <m:r>
-                      <m:t>j</m:t>
-                    </m:r>
-                  </m:sub>
-                </m:sSub>
-                <m:r>
-                  <m:rPr>
-                    <m:sty m:val="p"/>
-                  </m:rPr>
-                  <m:t>⋅</m:t>
-                </m:r>
-                <m:f>
-                  <m:fPr>
-                    <m:type m:val="bar"/>
-                  </m:fPr>
-                  <m:num>
-                    <m:sSub>
-                      <m:e>
-                        <m:r>
-                          <m:t>u</m:t>
-                        </m:r>
-                      </m:e>
-                      <m:sub>
-                        <m:r>
-                          <m:t>p</m:t>
-                        </m:r>
-                        <m:r>
-                          <m:rPr>
-                            <m:sty m:val="p"/>
-                          </m:rPr>
-                          <m:t>,</m:t>
-                        </m:r>
-                        <m:r>
-                          <m:t>j</m:t>
-                        </m:r>
-                      </m:sub>
-                    </m:sSub>
-                    <m:r>
-                      <m:rPr>
-                        <m:sty m:val="p"/>
-                      </m:rPr>
-                      <m:t>−</m:t>
-                    </m:r>
-                    <m:sSub>
-                      <m:e>
-                        <m:r>
-                          <m:t>μ</m:t>
-                        </m:r>
-                      </m:e>
-                      <m:sub>
-                        <m:r>
-                          <m:t>p</m:t>
-                        </m:r>
-                      </m:sub>
-                    </m:sSub>
-                  </m:num>
-                  <m:den>
-                    <m:rad>
-                      <m:radPr>
-                        <m:degHide m:val="on"/>
-                      </m:radPr>
-                      <m:deg/>
-                      <m:e>
-                        <m:sSub>
-                          <m:e>
-                            <m:r>
-                              <m:t>v</m:t>
-                            </m:r>
-                          </m:e>
-                          <m:sub>
-                            <m:r>
-                              <m:t>p</m:t>
-                            </m:r>
-                          </m:sub>
-                        </m:sSub>
-                        <m:r>
-                          <m:rPr>
-                            <m:sty m:val="p"/>
-                          </m:rPr>
-                          <m:t>+</m:t>
-                        </m:r>
-                        <m:r>
-                          <m:t>ϵ</m:t>
-                        </m:r>
-                      </m:e>
-                    </m:rad>
-                  </m:den>
-                </m:f>
-                <m:r>
-                  <m:rPr>
-                    <m:sty m:val="p"/>
-                  </m:rPr>
-                  <m:t>+</m:t>
-                </m:r>
-                <m:sSub>
-                  <m:e>
-                    <m:r>
-                      <m:t>β</m:t>
-                    </m:r>
-                  </m:e>
-                  <m:sub>
-                    <m:r>
-                      <m:t>j</m:t>
-                    </m:r>
-                  </m:sub>
-                </m:sSub>
-                <m:r>
-                  <m:rPr>
-                    <m:sty m:val="p"/>
-                  </m:rPr>
-                  <m:t>,</m:t>
-                </m:r>
-              </m:e>
-            </m:mr>
-          </m:m>
+          <m:sSub>
+            <m:e>
+              <m:r>
+                <m:t>μ</m:t>
+              </m:r>
+            </m:e>
+            <m:sub>
+              <m:r>
+                <m:t>p</m:t>
+              </m:r>
+            </m:sub>
+          </m:sSub>
+          <m:r>
+            <m:rPr>
+              <m:sty m:val="p"/>
+            </m:rPr>
+            <m:t>=</m:t>
+          </m:r>
+          <m:f>
+            <m:fPr>
+              <m:type m:val="bar"/>
+            </m:fPr>
+            <m:num>
+              <m:r>
+                <m:t>1</m:t>
+              </m:r>
+            </m:num>
+            <m:den>
+              <m:r>
+                <m:t>768</m:t>
+              </m:r>
+            </m:den>
+          </m:f>
+          <m:nary>
+            <m:naryPr>
+              <m:chr m:val="∑"/>
+              <m:limLoc m:val="undOvr"/>
+              <m:subHide m:val="off"/>
+              <m:supHide m:val="off"/>
+            </m:naryPr>
+            <m:sub>
+              <m:r>
+                <m:t>j</m:t>
+              </m:r>
+              <m:r>
+                <m:rPr>
+                  <m:sty m:val="p"/>
+                </m:rPr>
+                <m:t>=</m:t>
+              </m:r>
+              <m:r>
+                <m:t>1</m:t>
+              </m:r>
+            </m:sub>
+            <m:sup>
+              <m:r>
+                <m:t>768</m:t>
+              </m:r>
+            </m:sup>
+            <m:e>
+              <m:sSub>
+                <m:e>
+                  <m:r>
+                    <m:t>u</m:t>
+                  </m:r>
+                </m:e>
+                <m:sub>
+                  <m:r>
+                    <m:t>p</m:t>
+                  </m:r>
+                  <m:r>
+                    <m:rPr>
+                      <m:sty m:val="p"/>
+                    </m:rPr>
+                    <m:t>,</m:t>
+                  </m:r>
+                  <m:r>
+                    <m:t>j</m:t>
+                  </m:r>
+                </m:sub>
+              </m:sSub>
+            </m:e>
+          </m:nary>
+        </m:oMath>
+      </m:oMathPara>
+    </w:p>
+    <w:p>
+      <w:pPr>
+        <w:pStyle w:val="FirstParagraph"/>
+      </w:pPr>
+      <m:oMathPara>
+        <m:oMathParaPr>
+          <m:jc m:val="center"/>
+        </m:oMathParaPr>
+        <m:oMath>
+          <m:sSub>
+            <m:e>
+              <m:r>
+                <m:t>v</m:t>
+              </m:r>
+            </m:e>
+            <m:sub>
+              <m:r>
+                <m:t>p</m:t>
+              </m:r>
+            </m:sub>
+          </m:sSub>
+          <m:r>
+            <m:rPr>
+              <m:sty m:val="p"/>
+            </m:rPr>
+            <m:t>=</m:t>
+          </m:r>
+          <m:f>
+            <m:fPr>
+              <m:type m:val="bar"/>
+            </m:fPr>
+            <m:num>
+              <m:r>
+                <m:t>1</m:t>
+              </m:r>
+            </m:num>
+            <m:den>
+              <m:r>
+                <m:t>768</m:t>
+              </m:r>
+            </m:den>
+          </m:f>
+          <m:nary>
+            <m:naryPr>
+              <m:chr m:val="∑"/>
+              <m:limLoc m:val="undOvr"/>
+              <m:subHide m:val="off"/>
+              <m:supHide m:val="off"/>
+            </m:naryPr>
+            <m:sub>
+              <m:r>
+                <m:t>j</m:t>
+              </m:r>
+              <m:r>
+                <m:rPr>
+                  <m:sty m:val="p"/>
+                </m:rPr>
+                <m:t>=</m:t>
+              </m:r>
+              <m:r>
+                <m:t>1</m:t>
+              </m:r>
+            </m:sub>
+            <m:sup>
+              <m:r>
+                <m:t>768</m:t>
+              </m:r>
+            </m:sup>
+            <m:e>
+              <m:sSubSup>
+                <m:e>
+                  <m:r>
+                    <m:t>u</m:t>
+                  </m:r>
+                </m:e>
+                <m:sub>
+                  <m:r>
+                    <m:t>p</m:t>
+                  </m:r>
+                  <m:r>
+                    <m:rPr>
+                      <m:sty m:val="p"/>
+                    </m:rPr>
+                    <m:t>,</m:t>
+                  </m:r>
+                  <m:r>
+                    <m:t>j</m:t>
+                  </m:r>
+                </m:sub>
+                <m:sup>
+                  <m:r>
+                    <m:t>2</m:t>
+                  </m:r>
+                </m:sup>
+              </m:sSubSup>
+            </m:e>
+          </m:nary>
+          <m:r>
+            <m:rPr>
+              <m:sty m:val="p"/>
+            </m:rPr>
+            <m:t>−</m:t>
+          </m:r>
+          <m:sSubSup>
+            <m:e>
+              <m:r>
+                <m:t>μ</m:t>
+              </m:r>
+            </m:e>
+            <m:sub>
+              <m:r>
+                <m:t>p</m:t>
+              </m:r>
+            </m:sub>
+            <m:sup>
+              <m:r>
+                <m:t>2</m:t>
+              </m:r>
+            </m:sup>
+          </m:sSubSup>
+        </m:oMath>
+      </m:oMathPara>
+    </w:p>
+    <w:p>
+      <w:pPr>
+        <w:pStyle w:val="FirstParagraph"/>
+      </w:pPr>
+      <m:oMathPara>
+        <m:oMathParaPr>
+          <m:jc m:val="center"/>
+        </m:oMathParaPr>
+        <m:oMath>
+          <m:sSub>
+            <m:e>
+              <m:r>
+                <m:t>h</m:t>
+              </m:r>
+            </m:e>
+            <m:sub>
+              <m:r>
+                <m:t>p</m:t>
+              </m:r>
+              <m:r>
+                <m:rPr>
+                  <m:sty m:val="p"/>
+                </m:rPr>
+                <m:t>,</m:t>
+              </m:r>
+              <m:r>
+                <m:t>j</m:t>
+              </m:r>
+            </m:sub>
+          </m:sSub>
+          <m:r>
+            <m:rPr>
+              <m:sty m:val="p"/>
+            </m:rPr>
+            <m:t>=</m:t>
+          </m:r>
+          <m:sSub>
+            <m:e>
+              <m:r>
+                <m:t>γ</m:t>
+              </m:r>
+            </m:e>
+            <m:sub>
+              <m:r>
+                <m:t>j</m:t>
+              </m:r>
+            </m:sub>
+          </m:sSub>
+          <m:r>
+            <m:rPr>
+              <m:sty m:val="p"/>
+            </m:rPr>
+            <m:t>⋅</m:t>
+          </m:r>
+          <m:f>
+            <m:fPr>
+              <m:type m:val="bar"/>
+            </m:fPr>
+            <m:num>
+              <m:sSub>
+                <m:e>
+                  <m:r>
+                    <m:t>u</m:t>
+                  </m:r>
+                </m:e>
+                <m:sub>
+                  <m:r>
+                    <m:t>p</m:t>
+                  </m:r>
+                  <m:r>
+                    <m:rPr>
+                      <m:sty m:val="p"/>
+                    </m:rPr>
+                    <m:t>,</m:t>
+                  </m:r>
+                  <m:r>
+                    <m:t>j</m:t>
+                  </m:r>
+                </m:sub>
+              </m:sSub>
+              <m:r>
+                <m:rPr>
+                  <m:sty m:val="p"/>
+                </m:rPr>
+                <m:t>−</m:t>
+              </m:r>
+              <m:sSub>
+                <m:e>
+                  <m:r>
+                    <m:t>μ</m:t>
+                  </m:r>
+                </m:e>
+                <m:sub>
+                  <m:r>
+                    <m:t>p</m:t>
+                  </m:r>
+                </m:sub>
+              </m:sSub>
+            </m:num>
+            <m:den>
+              <m:rad>
+                <m:radPr>
+                  <m:degHide m:val="on"/>
+                </m:radPr>
+                <m:deg/>
+                <m:e>
+                  <m:sSub>
+                    <m:e>
+                      <m:r>
+                        <m:t>v</m:t>
+                      </m:r>
+                    </m:e>
+                    <m:sub>
+                      <m:r>
+                        <m:t>p</m:t>
+                      </m:r>
+                    </m:sub>
+                  </m:sSub>
+                  <m:r>
+                    <m:rPr>
+                      <m:sty m:val="p"/>
+                    </m:rPr>
+                    <m:t>+</m:t>
+                  </m:r>
+                  <m:r>
+                    <m:t>ϵ</m:t>
+                  </m:r>
+                </m:e>
+              </m:rad>
+            </m:den>
+          </m:f>
+          <m:r>
+            <m:rPr>
+              <m:sty m:val="p"/>
+            </m:rPr>
+            <m:t>+</m:t>
+          </m:r>
+          <m:sSub>
+            <m:e>
+              <m:r>
+                <m:t>β</m:t>
+              </m:r>
+            </m:e>
+            <m:sub>
+              <m:r>
+                <m:t>j</m:t>
+              </m:r>
+            </m:sub>
+          </m:sSub>
         </m:oMath>
       </m:oMathPara>
     </w:p>
@@ -4425,493 +4361,461 @@
           <m:jc m:val="center"/>
         </m:oMathParaPr>
         <m:oMath>
-          <m:m>
-            <m:mPr>
-              <m:baseJc m:val="center"/>
-              <m:plcHide m:val="on"/>
-              <m:mcs>
-                <m:mc>
-                  <m:mcPr>
-                    <m:mcJc m:val="right"/>
-                    <m:count m:val="1"/>
-                  </m:mcPr>
-                </m:mc>
-                <m:mc>
-                  <m:mcPr>
-                    <m:mcJc m:val="left"/>
-                    <m:count m:val="1"/>
-                  </m:mcPr>
-                </m:mc>
-              </m:mcs>
-            </m:mPr>
-            <m:mr>
-              <m:e>
-                <m:r>
-                  <m:rPr>
-                    <m:sty m:val="p"/>
-                  </m:rPr>
-                  <m:t>⟨</m:t>
-                </m:r>
-                <m:sSub>
-                  <m:e>
-                    <m:r>
-                      <m:t>r</m:t>
-                    </m:r>
-                  </m:e>
-                  <m:sub>
-                    <m:r>
-                      <m:t>0</m:t>
-                    </m:r>
-                  </m:sub>
-                </m:sSub>
-                <m:sSup>
-                  <m:e>
-                    <m:r>
-                      <m:rPr>
-                        <m:sty m:val="p"/>
-                      </m:rPr>
-                      <m:t>⟩</m:t>
-                    </m:r>
-                  </m:e>
-                  <m:sup>
-                    <m:r>
-                      <m:t>A</m:t>
-                    </m:r>
-                  </m:sup>
-                </m:sSup>
-              </m:e>
-              <m:e>
-                <m:r>
-                  <m:rPr>
-                    <m:sty m:val="p"/>
-                  </m:rPr>
-                  <m:t>=</m:t>
-                </m:r>
-                <m:nary>
-                  <m:naryPr>
-                    <m:chr m:val="∑"/>
-                    <m:limLoc m:val="undOvr"/>
-                    <m:subHide m:val="off"/>
-                    <m:supHide m:val="off"/>
-                  </m:naryPr>
-                  <m:sub>
-                    <m:r>
-                      <m:t>k</m:t>
-                    </m:r>
-                    <m:r>
-                      <m:rPr>
-                        <m:sty m:val="p"/>
-                      </m:rPr>
-                      <m:t>=</m:t>
-                    </m:r>
-                    <m:r>
-                      <m:t>0</m:t>
-                    </m:r>
-                  </m:sub>
-                  <m:sup>
-                    <m:r>
-                      <m:t>7</m:t>
-                    </m:r>
-                  </m:sup>
-                  <m:e>
-                    <m:r>
-                      <m:rPr>
-                        <m:sty m:val="p"/>
-                      </m:rPr>
-                      <m:t>⟨</m:t>
-                    </m:r>
-                  </m:e>
-                </m:nary>
-                <m:sSub>
-                  <m:e>
-                    <m:r>
-                      <m:t>b</m:t>
-                    </m:r>
-                  </m:e>
-                  <m:sub>
-                    <m:r>
-                      <m:t>k</m:t>
-                    </m:r>
-                  </m:sub>
-                </m:sSub>
-                <m:sSup>
-                  <m:e>
-                    <m:r>
-                      <m:rPr>
-                        <m:sty m:val="p"/>
-                      </m:rPr>
-                      <m:t>⟩</m:t>
-                    </m:r>
-                  </m:e>
-                  <m:sup>
-                    <m:r>
-                      <m:t>A</m:t>
-                    </m:r>
-                  </m:sup>
-                </m:sSup>
-                <m:sSub>
-                  <m:e>
-                    <m:r>
-                      <m:t>α</m:t>
-                    </m:r>
-                  </m:e>
-                  <m:sub>
-                    <m:r>
-                      <m:t>k</m:t>
-                    </m:r>
-                  </m:sub>
-                </m:sSub>
-                <m:r>
-                  <m:rPr>
-                    <m:sty m:val="p"/>
-                  </m:rPr>
-                  <m:t>−</m:t>
-                </m:r>
-                <m:sSub>
-                  <m:e>
-                    <m:r>
-                      <m:rPr>
-                        <m:sty m:val="p"/>
-                      </m:rPr>
-                      <m:t>T</m:t>
-                    </m:r>
-                    <m:r>
-                      <m:rPr>
-                        <m:sty m:val="p"/>
-                      </m:rPr>
-                      <m:t>r</m:t>
-                    </m:r>
-                    <m:r>
-                      <m:rPr>
-                        <m:sty m:val="p"/>
-                      </m:rPr>
-                      <m:t>u</m:t>
-                    </m:r>
-                    <m:r>
-                      <m:rPr>
-                        <m:sty m:val="p"/>
-                      </m:rPr>
-                      <m:t>n</m:t>
-                    </m:r>
-                    <m:r>
-                      <m:rPr>
-                        <m:sty m:val="p"/>
-                      </m:rPr>
-                      <m:t>c</m:t>
-                    </m:r>
-                  </m:e>
-                  <m:sub>
-                    <m:r>
-                      <m:t>20</m:t>
-                    </m:r>
-                  </m:sub>
-                </m:sSub>
-                <m:r>
-                  <m:t>​</m:t>
-                </m:r>
-                <m:d>
-                  <m:dPr>
-                    <m:begChr m:val="("/>
-                    <m:endChr m:val=")"/>
-                    <m:sepChr m:val=""/>
-                    <m:grow/>
-                  </m:dPr>
-                  <m:e>
-                    <m:d>
-                      <m:dPr>
-                        <m:begChr m:val="("/>
-                        <m:endChr m:val=")"/>
-                        <m:sepChr m:val=""/>
-                        <m:grow/>
-                      </m:dPr>
-                      <m:e>
-                        <m:nary>
-                          <m:naryPr>
-                            <m:chr m:val="∑"/>
-                            <m:limLoc m:val="undOvr"/>
-                            <m:subHide m:val="off"/>
-                            <m:supHide m:val="off"/>
-                          </m:naryPr>
-                          <m:sub>
-                            <m:r>
-                              <m:t>k</m:t>
-                            </m:r>
-                            <m:r>
-                              <m:rPr>
-                                <m:sty m:val="p"/>
-                              </m:rPr>
-                              <m:t>=</m:t>
-                            </m:r>
-                            <m:r>
-                              <m:t>0</m:t>
-                            </m:r>
-                          </m:sub>
-                          <m:sup>
-                            <m:r>
-                              <m:t>7</m:t>
-                            </m:r>
-                          </m:sup>
-                          <m:e>
-                            <m:r>
-                              <m:rPr>
-                                <m:sty m:val="p"/>
-                              </m:rPr>
-                              <m:t>⟨</m:t>
-                            </m:r>
-                          </m:e>
-                        </m:nary>
-                        <m:sSub>
-                          <m:e>
-                            <m:r>
-                              <m:t>b</m:t>
-                            </m:r>
-                          </m:e>
-                          <m:sub>
-                            <m:r>
-                              <m:t>k</m:t>
-                            </m:r>
-                          </m:sub>
-                        </m:sSub>
-                        <m:sSup>
-                          <m:e>
-                            <m:r>
-                              <m:rPr>
-                                <m:sty m:val="p"/>
-                              </m:rPr>
-                              <m:t>⟩</m:t>
-                            </m:r>
-                          </m:e>
-                          <m:sup>
-                            <m:r>
-                              <m:t>A</m:t>
-                            </m:r>
-                          </m:sup>
-                        </m:sSup>
-                        <m:sSub>
-                          <m:e>
-                            <m:r>
-                              <m:t>β</m:t>
-                            </m:r>
-                          </m:e>
-                          <m:sub>
-                            <m:r>
-                              <m:t>k</m:t>
-                            </m:r>
-                          </m:sub>
-                        </m:sSub>
-                      </m:e>
-                    </m:d>
-                    <m:r>
-                      <m:rPr>
-                        <m:sty m:val="p"/>
-                      </m:rPr>
-                      <m:t>⟨</m:t>
-                    </m:r>
-                    <m:r>
-                      <m:t>s</m:t>
-                    </m:r>
-                    <m:sSup>
-                      <m:e>
-                        <m:r>
-                          <m:rPr>
-                            <m:sty m:val="p"/>
-                          </m:rPr>
-                          <m:t>⟩</m:t>
-                        </m:r>
-                      </m:e>
-                      <m:sup>
-                        <m:r>
-                          <m:t>A</m:t>
-                        </m:r>
-                      </m:sup>
-                    </m:sSup>
-                  </m:e>
-                </m:d>
-                <m:r>
-                  <m:rPr>
-                    <m:sty m:val="p"/>
-                  </m:rPr>
-                  <m:t>,</m:t>
-                </m:r>
-              </m:e>
-            </m:mr>
-            <m:mr>
-              <m:e>
-                <m:sSub>
-                  <m:e>
-                    <m:r>
-                      <m:t>α</m:t>
-                    </m:r>
-                  </m:e>
-                  <m:sub>
-                    <m:r>
-                      <m:t>k</m:t>
-                    </m:r>
-                  </m:sub>
-                </m:sSub>
-              </m:e>
-              <m:e>
-                <m:r>
-                  <m:rPr>
-                    <m:sty m:val="p"/>
-                  </m:rPr>
-                  <m:t>=</m:t>
-                </m:r>
-                <m:f>
-                  <m:fPr>
-                    <m:type m:val="bar"/>
-                  </m:fPr>
-                  <m:num>
-                    <m:r>
-                      <m:t>48</m:t>
-                    </m:r>
-                  </m:num>
-                  <m:den>
-                    <m:r>
-                      <m:t>17</m:t>
-                    </m:r>
-                  </m:den>
-                </m:f>
-                <m:r>
-                  <m:rPr>
-                    <m:sty m:val="p"/>
-                  </m:rPr>
-                  <m:t>⋅</m:t>
-                </m:r>
-                <m:sSup>
-                  <m:e>
-                    <m:r>
-                      <m:t>2</m:t>
-                    </m:r>
-                  </m:e>
-                  <m:sup>
-                    <m:r>
-                      <m:rPr>
-                        <m:sty m:val="p"/>
-                      </m:rPr>
-                      <m:t>−</m:t>
-                    </m:r>
-                    <m:d>
-                      <m:dPr>
-                        <m:begChr m:val="("/>
-                        <m:endChr m:val=")"/>
-                        <m:sepChr m:val=""/>
-                        <m:grow/>
-                      </m:dPr>
-                      <m:e>
-                        <m:r>
-                          <m:t>k</m:t>
-                        </m:r>
-                        <m:r>
-                          <m:rPr>
-                            <m:sty m:val="p"/>
-                          </m:rPr>
-                          <m:t>+</m:t>
-                        </m:r>
-                        <m:r>
-                          <m:t>1</m:t>
-                        </m:r>
-                      </m:e>
-                    </m:d>
-                  </m:sup>
-                </m:sSup>
-                <m:r>
-                  <m:rPr>
-                    <m:sty m:val="p"/>
-                  </m:rPr>
-                  <m:t>,</m:t>
-                </m:r>
-                <m:r>
-                  <m:t>  </m:t>
-                </m:r>
-                <m:sSub>
-                  <m:e>
-                    <m:r>
-                      <m:t>β</m:t>
-                    </m:r>
-                  </m:e>
-                  <m:sub>
-                    <m:r>
-                      <m:t>k</m:t>
-                    </m:r>
-                  </m:sub>
-                </m:sSub>
-                <m:r>
-                  <m:rPr>
-                    <m:sty m:val="p"/>
-                  </m:rPr>
-                  <m:t>=</m:t>
-                </m:r>
-                <m:f>
-                  <m:fPr>
-                    <m:type m:val="bar"/>
-                  </m:fPr>
-                  <m:num>
-                    <m:r>
-                      <m:t>32</m:t>
-                    </m:r>
-                  </m:num>
-                  <m:den>
-                    <m:r>
-                      <m:t>17</m:t>
-                    </m:r>
-                  </m:den>
-                </m:f>
-                <m:r>
-                  <m:rPr>
-                    <m:sty m:val="p"/>
-                  </m:rPr>
-                  <m:t>⋅</m:t>
-                </m:r>
-                <m:sSup>
-                  <m:e>
-                    <m:r>
-                      <m:t>2</m:t>
-                    </m:r>
-                  </m:e>
-                  <m:sup>
-                    <m:r>
-                      <m:rPr>
-                        <m:sty m:val="p"/>
-                      </m:rPr>
-                      <m:t>−</m:t>
-                    </m:r>
-                    <m:r>
-                      <m:t>2</m:t>
-                    </m:r>
-                    <m:d>
-                      <m:dPr>
-                        <m:begChr m:val="("/>
-                        <m:endChr m:val=")"/>
-                        <m:sepChr m:val=""/>
-                        <m:grow/>
-                      </m:dPr>
-                      <m:e>
-                        <m:r>
-                          <m:t>k</m:t>
-                        </m:r>
-                        <m:r>
-                          <m:rPr>
-                            <m:sty m:val="p"/>
-                          </m:rPr>
-                          <m:t>+</m:t>
-                        </m:r>
-                        <m:r>
-                          <m:t>1</m:t>
-                        </m:r>
-                      </m:e>
-                    </m:d>
-                  </m:sup>
-                </m:sSup>
-                <m:r>
-                  <m:rPr>
-                    <m:sty m:val="p"/>
-                  </m:rPr>
-                  <m:t>.</m:t>
-                </m:r>
-              </m:e>
-            </m:mr>
-          </m:m>
+          <m:r>
+            <m:rPr>
+              <m:sty m:val="p"/>
+            </m:rPr>
+            <m:t>⟨</m:t>
+          </m:r>
+          <m:sSub>
+            <m:e>
+              <m:r>
+                <m:t>r</m:t>
+              </m:r>
+            </m:e>
+            <m:sub>
+              <m:r>
+                <m:t>0</m:t>
+              </m:r>
+            </m:sub>
+          </m:sSub>
+          <m:sSup>
+            <m:e>
+              <m:r>
+                <m:rPr>
+                  <m:sty m:val="p"/>
+                </m:rPr>
+                <m:t>⟩</m:t>
+              </m:r>
+            </m:e>
+            <m:sup>
+              <m:r>
+                <m:t>A</m:t>
+              </m:r>
+            </m:sup>
+          </m:sSup>
+          <m:r>
+            <m:rPr>
+              <m:sty m:val="p"/>
+            </m:rPr>
+            <m:t>=</m:t>
+          </m:r>
+          <m:nary>
+            <m:naryPr>
+              <m:chr m:val="∑"/>
+              <m:limLoc m:val="undOvr"/>
+              <m:subHide m:val="off"/>
+              <m:supHide m:val="off"/>
+            </m:naryPr>
+            <m:sub>
+              <m:r>
+                <m:t>k</m:t>
+              </m:r>
+              <m:r>
+                <m:rPr>
+                  <m:sty m:val="p"/>
+                </m:rPr>
+                <m:t>=</m:t>
+              </m:r>
+              <m:r>
+                <m:t>0</m:t>
+              </m:r>
+            </m:sub>
+            <m:sup>
+              <m:r>
+                <m:t>7</m:t>
+              </m:r>
+            </m:sup>
+            <m:e>
+              <m:r>
+                <m:rPr>
+                  <m:sty m:val="p"/>
+                </m:rPr>
+                <m:t>⟨</m:t>
+              </m:r>
+            </m:e>
+          </m:nary>
+          <m:sSub>
+            <m:e>
+              <m:r>
+                <m:t>b</m:t>
+              </m:r>
+            </m:e>
+            <m:sub>
+              <m:r>
+                <m:t>k</m:t>
+              </m:r>
+            </m:sub>
+          </m:sSub>
+          <m:sSup>
+            <m:e>
+              <m:r>
+                <m:rPr>
+                  <m:sty m:val="p"/>
+                </m:rPr>
+                <m:t>⟩</m:t>
+              </m:r>
+            </m:e>
+            <m:sup>
+              <m:r>
+                <m:t>A</m:t>
+              </m:r>
+            </m:sup>
+          </m:sSup>
+          <m:sSub>
+            <m:e>
+              <m:r>
+                <m:t>α</m:t>
+              </m:r>
+            </m:e>
+            <m:sub>
+              <m:r>
+                <m:t>k</m:t>
+              </m:r>
+            </m:sub>
+          </m:sSub>
+          <m:r>
+            <m:rPr>
+              <m:sty m:val="p"/>
+            </m:rPr>
+            <m:t>−</m:t>
+          </m:r>
+          <m:sSub>
+            <m:e>
+              <m:r>
+                <m:rPr>
+                  <m:sty m:val="p"/>
+                </m:rPr>
+                <m:t>T</m:t>
+              </m:r>
+              <m:r>
+                <m:rPr>
+                  <m:sty m:val="p"/>
+                </m:rPr>
+                <m:t>r</m:t>
+              </m:r>
+              <m:r>
+                <m:rPr>
+                  <m:sty m:val="p"/>
+                </m:rPr>
+                <m:t>u</m:t>
+              </m:r>
+              <m:r>
+                <m:rPr>
+                  <m:sty m:val="p"/>
+                </m:rPr>
+                <m:t>n</m:t>
+              </m:r>
+              <m:r>
+                <m:rPr>
+                  <m:sty m:val="p"/>
+                </m:rPr>
+                <m:t>c</m:t>
+              </m:r>
+            </m:e>
+            <m:sub>
+              <m:r>
+                <m:t>20</m:t>
+              </m:r>
+            </m:sub>
+          </m:sSub>
+          <m:d>
+            <m:dPr>
+              <m:begChr m:val="("/>
+              <m:endChr m:val=")"/>
+              <m:sepChr m:val=""/>
+              <m:grow/>
+            </m:dPr>
+            <m:e>
+              <m:d>
+                <m:dPr>
+                  <m:begChr m:val="("/>
+                  <m:endChr m:val=")"/>
+                  <m:sepChr m:val=""/>
+                  <m:grow/>
+                </m:dPr>
+                <m:e>
+                  <m:nary>
+                    <m:naryPr>
+                      <m:chr m:val="∑"/>
+                      <m:limLoc m:val="undOvr"/>
+                      <m:subHide m:val="off"/>
+                      <m:supHide m:val="off"/>
+                    </m:naryPr>
+                    <m:sub>
+                      <m:r>
+                        <m:t>k</m:t>
+                      </m:r>
+                      <m:r>
+                        <m:rPr>
+                          <m:sty m:val="p"/>
+                        </m:rPr>
+                        <m:t>=</m:t>
+                      </m:r>
+                      <m:r>
+                        <m:t>0</m:t>
+                      </m:r>
+                    </m:sub>
+                    <m:sup>
+                      <m:r>
+                        <m:t>7</m:t>
+                      </m:r>
+                    </m:sup>
+                    <m:e>
+                      <m:r>
+                        <m:rPr>
+                          <m:sty m:val="p"/>
+                        </m:rPr>
+                        <m:t>⟨</m:t>
+                      </m:r>
+                    </m:e>
+                  </m:nary>
+                  <m:sSub>
+                    <m:e>
+                      <m:r>
+                        <m:t>b</m:t>
+                      </m:r>
+                    </m:e>
+                    <m:sub>
+                      <m:r>
+                        <m:t>k</m:t>
+                      </m:r>
+                    </m:sub>
+                  </m:sSub>
+                  <m:sSup>
+                    <m:e>
+                      <m:r>
+                        <m:rPr>
+                          <m:sty m:val="p"/>
+                        </m:rPr>
+                        <m:t>⟩</m:t>
+                      </m:r>
+                    </m:e>
+                    <m:sup>
+                      <m:r>
+                        <m:t>A</m:t>
+                      </m:r>
+                    </m:sup>
+                  </m:sSup>
+                  <m:sSub>
+                    <m:e>
+                      <m:r>
+                        <m:t>β</m:t>
+                      </m:r>
+                    </m:e>
+                    <m:sub>
+                      <m:r>
+                        <m:t>k</m:t>
+                      </m:r>
+                    </m:sub>
+                  </m:sSub>
+                </m:e>
+              </m:d>
+              <m:r>
+                <m:rPr>
+                  <m:sty m:val="p"/>
+                </m:rPr>
+                <m:t>⟨</m:t>
+              </m:r>
+              <m:r>
+                <m:t>s</m:t>
+              </m:r>
+              <m:sSup>
+                <m:e>
+                  <m:r>
+                    <m:rPr>
+                      <m:sty m:val="p"/>
+                    </m:rPr>
+                    <m:t>⟩</m:t>
+                  </m:r>
+                </m:e>
+                <m:sup>
+                  <m:r>
+                    <m:t>A</m:t>
+                  </m:r>
+                </m:sup>
+              </m:sSup>
+            </m:e>
+          </m:d>
+        </m:oMath>
+      </m:oMathPara>
+    </w:p>
+    <w:p>
+      <w:pPr>
+        <w:pStyle w:val="FirstParagraph"/>
+      </w:pPr>
+      <m:oMathPara>
+        <m:oMathParaPr>
+          <m:jc m:val="center"/>
+        </m:oMathParaPr>
+        <m:oMath>
+          <m:sSub>
+            <m:e>
+              <m:r>
+                <m:t>α</m:t>
+              </m:r>
+            </m:e>
+            <m:sub>
+              <m:r>
+                <m:t>k</m:t>
+              </m:r>
+            </m:sub>
+          </m:sSub>
+          <m:r>
+            <m:rPr>
+              <m:sty m:val="p"/>
+            </m:rPr>
+            <m:t>=</m:t>
+          </m:r>
+          <m:f>
+            <m:fPr>
+              <m:type m:val="bar"/>
+            </m:fPr>
+            <m:num>
+              <m:r>
+                <m:t>48</m:t>
+              </m:r>
+            </m:num>
+            <m:den>
+              <m:r>
+                <m:t>17</m:t>
+              </m:r>
+            </m:den>
+          </m:f>
+          <m:r>
+            <m:rPr>
+              <m:sty m:val="p"/>
+            </m:rPr>
+            <m:t>⋅</m:t>
+          </m:r>
+          <m:sSup>
+            <m:e>
+              <m:r>
+                <m:t>2</m:t>
+              </m:r>
+            </m:e>
+            <m:sup>
+              <m:r>
+                <m:rPr>
+                  <m:sty m:val="p"/>
+                </m:rPr>
+                <m:t>−</m:t>
+              </m:r>
+              <m:d>
+                <m:dPr>
+                  <m:begChr m:val="("/>
+                  <m:endChr m:val=")"/>
+                  <m:sepChr m:val=""/>
+                  <m:grow/>
+                </m:dPr>
+                <m:e>
+                  <m:r>
+                    <m:t>k</m:t>
+                  </m:r>
+                  <m:r>
+                    <m:rPr>
+                      <m:sty m:val="p"/>
+                    </m:rPr>
+                    <m:t>+</m:t>
+                  </m:r>
+                  <m:r>
+                    <m:t>1</m:t>
+                  </m:r>
+                </m:e>
+              </m:d>
+            </m:sup>
+          </m:sSup>
+        </m:oMath>
+      </m:oMathPara>
+    </w:p>
+    <w:p>
+      <w:pPr>
+        <w:pStyle w:val="FirstParagraph"/>
+      </w:pPr>
+      <m:oMathPara>
+        <m:oMathParaPr>
+          <m:jc m:val="center"/>
+        </m:oMathParaPr>
+        <m:oMath>
+          <m:sSub>
+            <m:e>
+              <m:r>
+                <m:t>β</m:t>
+              </m:r>
+            </m:e>
+            <m:sub>
+              <m:r>
+                <m:t>k</m:t>
+              </m:r>
+            </m:sub>
+          </m:sSub>
+          <m:r>
+            <m:rPr>
+              <m:sty m:val="p"/>
+            </m:rPr>
+            <m:t>=</m:t>
+          </m:r>
+          <m:f>
+            <m:fPr>
+              <m:type m:val="bar"/>
+            </m:fPr>
+            <m:num>
+              <m:r>
+                <m:t>32</m:t>
+              </m:r>
+            </m:num>
+            <m:den>
+              <m:r>
+                <m:t>17</m:t>
+              </m:r>
+            </m:den>
+          </m:f>
+          <m:r>
+            <m:rPr>
+              <m:sty m:val="p"/>
+            </m:rPr>
+            <m:t>⋅</m:t>
+          </m:r>
+          <m:sSup>
+            <m:e>
+              <m:r>
+                <m:t>2</m:t>
+              </m:r>
+            </m:e>
+            <m:sup>
+              <m:r>
+                <m:rPr>
+                  <m:sty m:val="p"/>
+                </m:rPr>
+                <m:t>−</m:t>
+              </m:r>
+              <m:r>
+                <m:t>2</m:t>
+              </m:r>
+              <m:d>
+                <m:dPr>
+                  <m:begChr m:val="("/>
+                  <m:endChr m:val=")"/>
+                  <m:sepChr m:val=""/>
+                  <m:grow/>
+                </m:dPr>
+                <m:e>
+                  <m:r>
+                    <m:t>k</m:t>
+                  </m:r>
+                  <m:r>
+                    <m:rPr>
+                      <m:sty m:val="p"/>
+                    </m:rPr>
+                    <m:t>+</m:t>
+                  </m:r>
+                  <m:r>
+                    <m:t>1</m:t>
+                  </m:r>
+                </m:e>
+              </m:d>
+            </m:sup>
+          </m:sSup>
         </m:oMath>
       </m:oMathPara>
     </w:p>

</xml_diff>

<commit_message>
Explain the letters used in the progress-section formulas.
A notation paragraph defines indices, shares, LayerNorm statistics, and Softmax symbols before the operators are derived.

Co-authored-by: Tryrail4510471 <Tryrail4510471@users.noreply.github.com>
</commit_message>
<xml_diff>
--- a/paper/midterm_section2_progress.docx
+++ b/paper/midterm_section2_progress.docx
@@ -17,6 +17,917 @@
       </w:pPr>
       <w:r>
         <w:t xml:space="preserve">研究按「先实现算子，再逐级拼成 BERT-base，最后用实验逐级论证」推进。公开 BERT-base 的前向被拆成输入嵌入、私有矩阵乘、Softmax、GELU、LayerNorm，再由这些算子组成注意力、前馈网络、Pooler 和分类头。三台 NVIDIA A10 上使用 hpmpc 的 Trio 半诚实三方协议。权重保持为算术分享，token 编号和 padding 掩码对三方公开，中间激活不还原，最后只揭示两个 logit。下面先说明各算子的实现，再按同一顺序给出实验结果。</w:t>
+      </w:r>
+    </w:p>
+    <w:p>
+      <w:pPr>
+        <w:pStyle w:val="BodyText"/>
+      </w:pPr>
+      <w:r>
+        <w:t xml:space="preserve">后文公式里的字母按这个含义使用。</w:t>
+      </w:r>
+      <m:oMath>
+        <m:sSub>
+          <m:e>
+            <m:r>
+              <m:t>P</m:t>
+            </m:r>
+          </m:e>
+          <m:sub>
+            <m:r>
+              <m:t>0</m:t>
+            </m:r>
+          </m:sub>
+        </m:sSub>
+      </m:oMath>
+      <w:r>
+        <w:t xml:space="preserve"> </w:t>
+      </w:r>
+      <w:r>
+        <w:t xml:space="preserve">是保存明文权重的模型所有者，</w:t>
+      </w:r>
+      <m:oMath>
+        <m:sSub>
+          <m:e>
+            <m:r>
+              <m:t>P</m:t>
+            </m:r>
+          </m:e>
+          <m:sub>
+            <m:r>
+              <m:t>1</m:t>
+            </m:r>
+          </m:sub>
+        </m:sSub>
+      </m:oMath>
+      <w:r>
+        <w:t xml:space="preserve"> </w:t>
+      </w:r>
+      <w:r>
+        <w:t xml:space="preserve">和</w:t>
+      </w:r>
+      <w:r>
+        <w:t xml:space="preserve"> </w:t>
+      </w:r>
+      <m:oMath>
+        <m:sSub>
+          <m:e>
+            <m:r>
+              <m:t>P</m:t>
+            </m:r>
+          </m:e>
+          <m:sub>
+            <m:r>
+              <m:t>2</m:t>
+            </m:r>
+          </m:sub>
+        </m:sSub>
+      </m:oMath>
+      <w:r>
+        <w:t xml:space="preserve"> </w:t>
+      </w:r>
+      <w:r>
+        <w:t xml:space="preserve">是另外两方。</w:t>
+      </w:r>
+      <m:oMath>
+        <m:r>
+          <m:t>B</m:t>
+        </m:r>
+      </m:oMath>
+      <w:r>
+        <w:t xml:space="preserve"> </w:t>
+      </w:r>
+      <w:r>
+        <w:t xml:space="preserve">是 batch，</w:t>
+      </w:r>
+      <m:oMath>
+        <m:r>
+          <m:t>L</m:t>
+        </m:r>
+      </m:oMath>
+      <w:r>
+        <w:t xml:space="preserve"> </w:t>
+      </w:r>
+      <w:r>
+        <w:t xml:space="preserve">是序列长度，</w:t>
+      </w:r>
+      <m:oMath>
+        <m:r>
+          <m:t>p</m:t>
+        </m:r>
+      </m:oMath>
+      <w:r>
+        <w:t xml:space="preserve"> </w:t>
+      </w:r>
+      <w:r>
+        <w:t xml:space="preserve">是其中一个位置，</w:t>
+      </w:r>
+      <m:oMath>
+        <m:r>
+          <m:t>j</m:t>
+        </m:r>
+      </m:oMath>
+      <w:r>
+        <w:t xml:space="preserve"> </w:t>
+      </w:r>
+      <w:r>
+        <w:t xml:space="preserve">是 768 维里的某一维。</w:t>
+      </w:r>
+      <m:oMath>
+        <m:sSub>
+          <m:e>
+            <m:r>
+              <m:t>t</m:t>
+            </m:r>
+          </m:e>
+          <m:sub>
+            <m:r>
+              <m:t>p</m:t>
+            </m:r>
+          </m:sub>
+        </m:sSub>
+      </m:oMath>
+      <w:r>
+        <w:t xml:space="preserve"> </w:t>
+      </w:r>
+      <w:r>
+        <w:t xml:space="preserve">是位置</w:t>
+      </w:r>
+      <w:r>
+        <w:t xml:space="preserve"> </w:t>
+      </w:r>
+      <m:oMath>
+        <m:r>
+          <m:t>p</m:t>
+        </m:r>
+      </m:oMath>
+      <w:r>
+        <w:t xml:space="preserve"> </w:t>
+      </w:r>
+      <w:r>
+        <w:t xml:space="preserve">的 token 编号，</w:t>
+      </w:r>
+      <m:oMath>
+        <m:sSub>
+          <m:e>
+            <m:r>
+              <m:t>s</m:t>
+            </m:r>
+          </m:e>
+          <m:sub>
+            <m:r>
+              <m:t>p</m:t>
+            </m:r>
+          </m:sub>
+        </m:sSub>
+      </m:oMath>
+      <w:r>
+        <w:t xml:space="preserve"> </w:t>
+      </w:r>
+      <w:r>
+        <w:t xml:space="preserve">是片段编号。</w:t>
+      </w:r>
+      <m:oMath>
+        <m:sSub>
+          <m:e>
+            <m:r>
+              <m:rPr>
+                <m:sty m:val="b"/>
+              </m:rPr>
+              <m:t>E</m:t>
+            </m:r>
+          </m:e>
+          <m:sub>
+            <m:r>
+              <m:rPr>
+                <m:sty m:val="p"/>
+              </m:rPr>
+              <m:t>t</m:t>
+            </m:r>
+            <m:r>
+              <m:rPr>
+                <m:sty m:val="p"/>
+              </m:rPr>
+              <m:t>o</m:t>
+            </m:r>
+            <m:r>
+              <m:rPr>
+                <m:sty m:val="p"/>
+              </m:rPr>
+              <m:t>k</m:t>
+            </m:r>
+          </m:sub>
+        </m:sSub>
+      </m:oMath>
+      <w:r>
+        <w:t xml:space="preserve">、</w:t>
+      </w:r>
+      <m:oMath>
+        <m:sSub>
+          <m:e>
+            <m:r>
+              <m:rPr>
+                <m:sty m:val="b"/>
+              </m:rPr>
+              <m:t>E</m:t>
+            </m:r>
+          </m:e>
+          <m:sub>
+            <m:r>
+              <m:rPr>
+                <m:sty m:val="p"/>
+              </m:rPr>
+              <m:t>p</m:t>
+            </m:r>
+            <m:r>
+              <m:rPr>
+                <m:sty m:val="p"/>
+              </m:rPr>
+              <m:t>o</m:t>
+            </m:r>
+            <m:r>
+              <m:rPr>
+                <m:sty m:val="p"/>
+              </m:rPr>
+              <m:t>s</m:t>
+            </m:r>
+          </m:sub>
+        </m:sSub>
+      </m:oMath>
+      <w:r>
+        <w:t xml:space="preserve">、</w:t>
+      </w:r>
+      <m:oMath>
+        <m:sSub>
+          <m:e>
+            <m:r>
+              <m:rPr>
+                <m:sty m:val="b"/>
+              </m:rPr>
+              <m:t>E</m:t>
+            </m:r>
+          </m:e>
+          <m:sub>
+            <m:r>
+              <m:rPr>
+                <m:sty m:val="p"/>
+              </m:rPr>
+              <m:t>s</m:t>
+            </m:r>
+            <m:r>
+              <m:rPr>
+                <m:sty m:val="p"/>
+              </m:rPr>
+              <m:t>e</m:t>
+            </m:r>
+            <m:r>
+              <m:rPr>
+                <m:sty m:val="p"/>
+              </m:rPr>
+              <m:t>g</m:t>
+            </m:r>
+          </m:sub>
+        </m:sSub>
+      </m:oMath>
+      <w:r>
+        <w:t xml:space="preserve"> </w:t>
+      </w:r>
+      <w:r>
+        <w:t xml:space="preserve">依次是词嵌入、位置嵌入和片段嵌入，</w:t>
+      </w:r>
+      <m:oMath>
+        <m:sSub>
+          <m:e>
+            <m:r>
+              <m:rPr>
+                <m:sty m:val="b"/>
+              </m:rPr>
+              <m:t>u</m:t>
+            </m:r>
+          </m:e>
+          <m:sub>
+            <m:r>
+              <m:t>p</m:t>
+            </m:r>
+          </m:sub>
+        </m:sSub>
+      </m:oMath>
+      <w:r>
+        <w:t xml:space="preserve"> </w:t>
+      </w:r>
+      <w:r>
+        <w:t xml:space="preserve">是三者相加后的向量。</w:t>
+      </w:r>
+      <m:oMath>
+        <m:sSub>
+          <m:e>
+            <m:r>
+              <m:t>μ</m:t>
+            </m:r>
+          </m:e>
+          <m:sub>
+            <m:r>
+              <m:t>p</m:t>
+            </m:r>
+          </m:sub>
+        </m:sSub>
+      </m:oMath>
+      <w:r>
+        <w:t xml:space="preserve"> </w:t>
+      </w:r>
+      <w:r>
+        <w:t xml:space="preserve">和</w:t>
+      </w:r>
+      <w:r>
+        <w:t xml:space="preserve"> </w:t>
+      </w:r>
+      <m:oMath>
+        <m:sSub>
+          <m:e>
+            <m:r>
+              <m:t>v</m:t>
+            </m:r>
+          </m:e>
+          <m:sub>
+            <m:r>
+              <m:t>p</m:t>
+            </m:r>
+          </m:sub>
+        </m:sSub>
+      </m:oMath>
+      <w:r>
+        <w:t xml:space="preserve"> </w:t>
+      </w:r>
+      <w:r>
+        <w:t xml:space="preserve">是该向量的均值和方差，</w:t>
+      </w:r>
+      <m:oMath>
+        <m:r>
+          <m:t>ϵ</m:t>
+        </m:r>
+      </m:oMath>
+      <w:r>
+        <w:t xml:space="preserve"> </w:t>
+      </w:r>
+      <w:r>
+        <w:t xml:space="preserve">是防止除零的小常数，</w:t>
+      </w:r>
+      <m:oMath>
+        <m:sSub>
+          <m:e>
+            <m:r>
+              <m:t>γ</m:t>
+            </m:r>
+          </m:e>
+          <m:sub>
+            <m:r>
+              <m:t>j</m:t>
+            </m:r>
+          </m:sub>
+        </m:sSub>
+      </m:oMath>
+      <w:r>
+        <w:t xml:space="preserve"> </w:t>
+      </w:r>
+      <w:r>
+        <w:t xml:space="preserve">和</w:t>
+      </w:r>
+      <w:r>
+        <w:t xml:space="preserve"> </w:t>
+      </w:r>
+      <m:oMath>
+        <m:sSub>
+          <m:e>
+            <m:r>
+              <m:t>β</m:t>
+            </m:r>
+          </m:e>
+          <m:sub>
+            <m:r>
+              <m:t>j</m:t>
+            </m:r>
+          </m:sub>
+        </m:sSub>
+      </m:oMath>
+      <w:r>
+        <w:t xml:space="preserve"> </w:t>
+      </w:r>
+      <w:r>
+        <w:t xml:space="preserve">是 LayerNorm 的缩放与平移，</w:t>
+      </w:r>
+      <m:oMath>
+        <m:sSub>
+          <m:e>
+            <m:r>
+              <m:t>h</m:t>
+            </m:r>
+          </m:e>
+          <m:sub>
+            <m:r>
+              <m:t>p</m:t>
+            </m:r>
+            <m:r>
+              <m:rPr>
+                <m:sty m:val="p"/>
+              </m:rPr>
+              <m:t>,</m:t>
+            </m:r>
+            <m:r>
+              <m:t>j</m:t>
+            </m:r>
+          </m:sub>
+        </m:sSub>
+      </m:oMath>
+      <w:r>
+        <w:t xml:space="preserve"> </w:t>
+      </w:r>
+      <w:r>
+        <w:t xml:space="preserve">是归一化后的第</w:t>
+      </w:r>
+      <w:r>
+        <w:t xml:space="preserve"> </w:t>
+      </w:r>
+      <m:oMath>
+        <m:r>
+          <m:t>j</m:t>
+        </m:r>
+      </m:oMath>
+      <w:r>
+        <w:t xml:space="preserve"> </w:t>
+      </w:r>
+      <w:r>
+        <w:t xml:space="preserve">维。</w:t>
+      </w:r>
+      <m:oMath>
+        <m:r>
+          <m:rPr>
+            <m:sty m:val="p"/>
+          </m:rPr>
+          <m:t>⟨</m:t>
+        </m:r>
+        <m:r>
+          <m:t>x</m:t>
+        </m:r>
+        <m:sSup>
+          <m:e>
+            <m:r>
+              <m:rPr>
+                <m:sty m:val="p"/>
+              </m:rPr>
+              <m:t>⟩</m:t>
+            </m:r>
+          </m:e>
+          <m:sup>
+            <m:r>
+              <m:t>A</m:t>
+            </m:r>
+          </m:sup>
+        </m:sSup>
+      </m:oMath>
+      <w:r>
+        <w:t xml:space="preserve"> </w:t>
+      </w:r>
+      <w:r>
+        <w:t xml:space="preserve">表示数</w:t>
+      </w:r>
+      <w:r>
+        <w:t xml:space="preserve"> </w:t>
+      </w:r>
+      <m:oMath>
+        <m:r>
+          <m:t>x</m:t>
+        </m:r>
+      </m:oMath>
+      <w:r>
+        <w:t xml:space="preserve"> </w:t>
+      </w:r>
+      <w:r>
+        <w:t xml:space="preserve">的算术分享，</w:t>
+      </w:r>
+      <m:oMath>
+        <m:r>
+          <m:rPr>
+            <m:sty m:val="p"/>
+          </m:rPr>
+          <m:t>⟨</m:t>
+        </m:r>
+        <m:r>
+          <m:t>x</m:t>
+        </m:r>
+        <m:sSup>
+          <m:e>
+            <m:r>
+              <m:rPr>
+                <m:sty m:val="p"/>
+              </m:rPr>
+              <m:t>⟩</m:t>
+            </m:r>
+          </m:e>
+          <m:sup>
+            <m:r>
+              <m:t>B</m:t>
+            </m:r>
+          </m:sup>
+        </m:sSup>
+      </m:oMath>
+      <w:r>
+        <w:t xml:space="preserve"> </w:t>
+      </w:r>
+      <w:r>
+        <w:t xml:space="preserve">表示布尔分享。定点数</w:t>
+      </w:r>
+      <w:r>
+        <w:t xml:space="preserve"> </w:t>
+      </w:r>
+      <m:oMath>
+        <m:r>
+          <m:t>a</m:t>
+        </m:r>
+      </m:oMath>
+      <w:r>
+        <w:t xml:space="preserve"> </w:t>
+      </w:r>
+      <w:r>
+        <w:t xml:space="preserve">拆成高 10 位</w:t>
+      </w:r>
+      <w:r>
+        <w:t xml:space="preserve"> </w:t>
+      </w:r>
+      <m:oMath>
+        <m:sSub>
+          <m:e>
+            <m:r>
+              <m:t>a</m:t>
+            </m:r>
+          </m:e>
+          <m:sub>
+            <m:r>
+              <m:t>h</m:t>
+            </m:r>
+          </m:sub>
+        </m:sSub>
+      </m:oMath>
+      <w:r>
+        <w:t xml:space="preserve"> </w:t>
+      </w:r>
+      <w:r>
+        <w:t xml:space="preserve">和低 10 位</w:t>
+      </w:r>
+      <w:r>
+        <w:t xml:space="preserve"> </w:t>
+      </w:r>
+      <m:oMath>
+        <m:sSub>
+          <m:e>
+            <m:r>
+              <m:t>a</m:t>
+            </m:r>
+          </m:e>
+          <m:sub>
+            <m:r>
+              <m:t>l</m:t>
+            </m:r>
+          </m:sub>
+        </m:sSub>
+      </m:oMath>
+      <w:r>
+        <w:t xml:space="preserve">。Softmax 里，</w:t>
+      </w:r>
+      <m:oMath>
+        <m:sSub>
+          <m:e>
+            <m:r>
+              <m:t>x</m:t>
+            </m:r>
+          </m:e>
+          <m:sub>
+            <m:r>
+              <m:t>i</m:t>
+            </m:r>
+          </m:sub>
+        </m:sSub>
+      </m:oMath>
+      <w:r>
+        <w:t xml:space="preserve"> </w:t>
+      </w:r>
+      <w:r>
+        <w:t xml:space="preserve">是一行中第</w:t>
+      </w:r>
+      <w:r>
+        <w:t xml:space="preserve"> </w:t>
+      </w:r>
+      <m:oMath>
+        <m:r>
+          <m:t>i</m:t>
+        </m:r>
+      </m:oMath>
+      <w:r>
+        <w:t xml:space="preserve"> </w:t>
+      </w:r>
+      <w:r>
+        <w:t xml:space="preserve">个分数，</w:t>
+      </w:r>
+      <m:oMath>
+        <m:r>
+          <m:t>m</m:t>
+        </m:r>
+      </m:oMath>
+      <w:r>
+        <w:t xml:space="preserve"> </w:t>
+      </w:r>
+      <w:r>
+        <w:t xml:space="preserve">是这一行的最大值，</w:t>
+      </w:r>
+      <m:oMath>
+        <m:sSub>
+          <m:e>
+            <m:r>
+              <m:t>p</m:t>
+            </m:r>
+          </m:e>
+          <m:sub>
+            <m:r>
+              <m:t>i</m:t>
+            </m:r>
+          </m:sub>
+        </m:sSub>
+      </m:oMath>
+      <w:r>
+        <w:t xml:space="preserve"> </w:t>
+      </w:r>
+      <w:r>
+        <w:t xml:space="preserve">是归一化权重，</w:t>
+      </w:r>
+      <m:oMath>
+        <m:sSub>
+          <m:e>
+            <m:r>
+              <m:t>δ</m:t>
+            </m:r>
+          </m:e>
+          <m:sub>
+            <m:r>
+              <m:t>i</m:t>
+            </m:r>
+          </m:sub>
+        </m:sSub>
+        <m:r>
+          <m:rPr>
+            <m:sty m:val="p"/>
+          </m:rPr>
+          <m:t>=</m:t>
+        </m:r>
+        <m:sSub>
+          <m:e>
+            <m:r>
+              <m:t>x</m:t>
+            </m:r>
+          </m:e>
+          <m:sub>
+            <m:r>
+              <m:t>i</m:t>
+            </m:r>
+          </m:sub>
+        </m:sSub>
+        <m:r>
+          <m:rPr>
+            <m:sty m:val="p"/>
+          </m:rPr>
+          <m:t>−</m:t>
+        </m:r>
+        <m:r>
+          <m:t>m</m:t>
+        </m:r>
+      </m:oMath>
+      <w:r>
+        <w:t xml:space="preserve">。</w:t>
+      </w:r>
+      <m:oMath>
+        <m:r>
+          <m:t>q</m:t>
+        </m:r>
+      </m:oMath>
+      <w:r>
+        <w:t xml:space="preserve"> </w:t>
+      </w:r>
+      <w:r>
+        <w:t xml:space="preserve">和</w:t>
+      </w:r>
+      <w:r>
+        <w:t xml:space="preserve"> </w:t>
+      </w:r>
+      <m:oMath>
+        <m:r>
+          <m:t>k</m:t>
+        </m:r>
+      </m:oMath>
+      <w:r>
+        <w:t xml:space="preserve"> </w:t>
+      </w:r>
+      <w:r>
+        <w:t xml:space="preserve">是查询向量和键向量，</w:t>
+      </w:r>
+      <m:oMath>
+        <m:r>
+          <m:t>h</m:t>
+        </m:r>
+      </m:oMath>
+      <w:r>
+        <w:t xml:space="preserve"> </w:t>
+      </w:r>
+      <w:r>
+        <w:t xml:space="preserve">是注意力头的编号，</w:t>
+      </w:r>
+      <m:oMath>
+        <m:sSub>
+          <m:e>
+            <m:r>
+              <m:t>m</m:t>
+            </m:r>
+          </m:e>
+          <m:sub>
+            <m:r>
+              <m:t>k</m:t>
+            </m:r>
+          </m:sub>
+        </m:sSub>
+      </m:oMath>
+      <w:r>
+        <w:t xml:space="preserve"> </w:t>
+      </w:r>
+      <w:r>
+        <w:t xml:space="preserve">是加在第</w:t>
+      </w:r>
+      <w:r>
+        <w:t xml:space="preserve"> </w:t>
+      </w:r>
+      <m:oMath>
+        <m:r>
+          <m:t>k</m:t>
+        </m:r>
+      </m:oMath>
+      <w:r>
+        <w:t xml:space="preserve"> </w:t>
+      </w:r>
+      <w:r>
+        <w:t xml:space="preserve">个键上的掩码。倒数公式里的</w:t>
+      </w:r>
+      <w:r>
+        <w:t xml:space="preserve"> </w:t>
+      </w:r>
+      <m:oMath>
+        <m:r>
+          <m:t>s</m:t>
+        </m:r>
+      </m:oMath>
+      <w:r>
+        <w:t xml:space="preserve"> </w:t>
+      </w:r>
+      <w:r>
+        <w:t xml:space="preserve">是一行指数的和，</w:t>
+      </w:r>
+      <m:oMath>
+        <m:r>
+          <m:t>r</m:t>
+        </m:r>
+      </m:oMath>
+      <w:r>
+        <w:t xml:space="preserve"> </w:t>
+      </w:r>
+      <w:r>
+        <w:t xml:space="preserve">是</w:t>
+      </w:r>
+      <w:r>
+        <w:t xml:space="preserve"> </w:t>
+      </w:r>
+      <m:oMath>
+        <m:r>
+          <m:t>1</m:t>
+        </m:r>
+        <m:r>
+          <m:rPr>
+            <m:sty m:val="p"/>
+          </m:rPr>
+          <m:t>/</m:t>
+        </m:r>
+        <m:r>
+          <m:t>s</m:t>
+        </m:r>
+      </m:oMath>
+      <w:r>
+        <w:t xml:space="preserve"> </w:t>
+      </w:r>
+      <w:r>
+        <w:t xml:space="preserve">的近似，</w:t>
+      </w:r>
+      <m:oMath>
+        <m:sSub>
+          <m:e>
+            <m:r>
+              <m:t>b</m:t>
+            </m:r>
+          </m:e>
+          <m:sub>
+            <m:r>
+              <m:t>k</m:t>
+            </m:r>
+          </m:sub>
+        </m:sSub>
+      </m:oMath>
+      <w:r>
+        <w:t xml:space="preserve"> </w:t>
+      </w:r>
+      <w:r>
+        <w:t xml:space="preserve">是区间选择位，</w:t>
+      </w:r>
+      <m:oMath>
+        <m:sSub>
+          <m:e>
+            <m:r>
+              <m:t>α</m:t>
+            </m:r>
+          </m:e>
+          <m:sub>
+            <m:r>
+              <m:t>k</m:t>
+            </m:r>
+          </m:sub>
+        </m:sSub>
+      </m:oMath>
+      <w:r>
+        <w:t xml:space="preserve"> </w:t>
+      </w:r>
+      <w:r>
+        <w:t xml:space="preserve">和</w:t>
+      </w:r>
+      <w:r>
+        <w:t xml:space="preserve"> </w:t>
+      </w:r>
+      <m:oMath>
+        <m:sSub>
+          <m:e>
+            <m:r>
+              <m:t>β</m:t>
+            </m:r>
+          </m:e>
+          <m:sub>
+            <m:r>
+              <m:t>k</m:t>
+            </m:r>
+          </m:sub>
+        </m:sSub>
+      </m:oMath>
+      <w:r>
+        <w:t xml:space="preserve"> </w:t>
+      </w:r>
+      <w:r>
+        <w:t xml:space="preserve">是公开种子系数；这里的</w:t>
+      </w:r>
+      <w:r>
+        <w:t xml:space="preserve"> </w:t>
+      </w:r>
+      <m:oMath>
+        <m:sSub>
+          <m:e>
+            <m:r>
+              <m:t>β</m:t>
+            </m:r>
+          </m:e>
+          <m:sub>
+            <m:r>
+              <m:t>k</m:t>
+            </m:r>
+          </m:sub>
+        </m:sSub>
+      </m:oMath>
+      <w:r>
+        <w:t xml:space="preserve"> </w:t>
+      </w:r>
+      <w:r>
+        <w:t xml:space="preserve">与 LayerNorm 的</w:t>
+      </w:r>
+      <w:r>
+        <w:t xml:space="preserve"> </w:t>
+      </w:r>
+      <m:oMath>
+        <m:sSub>
+          <m:e>
+            <m:r>
+              <m:t>β</m:t>
+            </m:r>
+          </m:e>
+          <m:sub>
+            <m:r>
+              <m:t>j</m:t>
+            </m:r>
+          </m:sub>
+        </m:sSub>
+      </m:oMath>
+      <w:r>
+        <w:t xml:space="preserve"> </w:t>
+      </w:r>
+      <w:r>
+        <w:t xml:space="preserve">不是同一个量。</w:t>
       </w:r>
     </w:p>
     <w:bookmarkStart w:id="27" w:name="一各算子的实现方式"/>
@@ -2040,7 +2951,122 @@
         <w:pStyle w:val="FirstParagraph"/>
       </w:pPr>
       <w:r>
-        <w:t xml:space="preserve">四次平方恢复</w:t>
+        <w:t xml:space="preserve">这里的</w:t>
+      </w:r>
+      <w:r>
+        <w:t xml:space="preserve"> </w:t>
+      </w:r>
+      <m:oMath>
+        <m:r>
+          <m:t>y</m:t>
+        </m:r>
+      </m:oMath>
+      <w:r>
+        <w:t xml:space="preserve"> </w:t>
+      </w:r>
+      <w:r>
+        <w:t xml:space="preserve">是把</w:t>
+      </w:r>
+      <w:r>
+        <w:t xml:space="preserve"> </w:t>
+      </w:r>
+      <m:oMath>
+        <m:sSub>
+          <m:e>
+            <m:r>
+              <m:t>δ</m:t>
+            </m:r>
+          </m:e>
+          <m:sub>
+            <m:r>
+              <m:t>i</m:t>
+            </m:r>
+          </m:sub>
+        </m:sSub>
+      </m:oMath>
+      <w:r>
+        <w:t xml:space="preserve"> </w:t>
+      </w:r>
+      <w:r>
+        <w:t xml:space="preserve">缩小 16 倍后的自变量，</w:t>
+      </w:r>
+      <m:oMath>
+        <m:sSub>
+          <m:e>
+            <m:r>
+              <m:t>T</m:t>
+            </m:r>
+          </m:e>
+          <m:sub>
+            <m:r>
+              <m:t>3</m:t>
+            </m:r>
+          </m:sub>
+        </m:sSub>
+        <m:d>
+          <m:dPr>
+            <m:begChr m:val="("/>
+            <m:endChr m:val=")"/>
+            <m:sepChr m:val=""/>
+            <m:grow/>
+          </m:dPr>
+          <m:e>
+            <m:r>
+              <m:t>y</m:t>
+            </m:r>
+          </m:e>
+        </m:d>
+      </m:oMath>
+      <w:r>
+        <w:t xml:space="preserve"> </w:t>
+      </w:r>
+      <w:r>
+        <w:t xml:space="preserve">是指数在</w:t>
+      </w:r>
+      <w:r>
+        <w:t xml:space="preserve"> </w:t>
+      </w:r>
+      <m:oMath>
+        <m:d>
+          <m:dPr>
+            <m:begChr m:val="["/>
+            <m:endChr m:val="]"/>
+            <m:sepChr m:val=""/>
+            <m:grow/>
+          </m:dPr>
+          <m:e>
+            <m:r>
+              <m:rPr>
+                <m:sty m:val="p"/>
+              </m:rPr>
+              <m:t>−</m:t>
+            </m:r>
+            <m:r>
+              <m:rPr>
+                <m:sty m:val="p"/>
+              </m:rPr>
+              <m:t>ln</m:t>
+            </m:r>
+            <m:r>
+              <m:t>2</m:t>
+            </m:r>
+            <m:r>
+              <m:rPr>
+                <m:sty m:val="p"/>
+              </m:rPr>
+              <m:t>,</m:t>
+            </m:r>
+            <m:r>
+              <m:t>0</m:t>
+            </m:r>
+          </m:e>
+        </m:d>
+      </m:oMath>
+      <w:r>
+        <w:t xml:space="preserve"> </w:t>
+      </w:r>
+      <w:r>
+        <w:t xml:space="preserve">上的三次近似。四次平方恢复</w:t>
       </w:r>
       <w:r>
         <w:t xml:space="preserve"> </w:t>
@@ -3804,7 +4830,142 @@
         <w:pStyle w:val="FirstParagraph"/>
       </w:pPr>
       <w:r>
-        <w:t xml:space="preserve">注意力先做联合 QKV 投影。</w:t>
+        <w:t xml:space="preserve">其中</w:t>
+      </w:r>
+      <w:r>
+        <w:t xml:space="preserve"> </w:t>
+      </w:r>
+      <m:oMath>
+        <m:r>
+          <m:rPr>
+            <m:sty m:val="b"/>
+          </m:rPr>
+          <m:t>x</m:t>
+        </m:r>
+      </m:oMath>
+      <w:r>
+        <w:t xml:space="preserve"> </w:t>
+      </w:r>
+      <w:r>
+        <w:t xml:space="preserve">是本层输入，</w:t>
+      </w:r>
+      <m:oMath>
+        <m:r>
+          <m:rPr>
+            <m:sty m:val="p"/>
+          </m:rPr>
+          <m:t>A</m:t>
+        </m:r>
+        <m:r>
+          <m:rPr>
+            <m:sty m:val="p"/>
+          </m:rPr>
+          <m:t>t</m:t>
+        </m:r>
+        <m:r>
+          <m:rPr>
+            <m:sty m:val="p"/>
+          </m:rPr>
+          <m:t>t</m:t>
+        </m:r>
+        <m:r>
+          <m:rPr>
+            <m:sty m:val="p"/>
+          </m:rPr>
+          <m:t>n</m:t>
+        </m:r>
+        <m:d>
+          <m:dPr>
+            <m:begChr m:val="("/>
+            <m:endChr m:val=")"/>
+            <m:sepChr m:val=""/>
+            <m:grow/>
+          </m:dPr>
+          <m:e>
+            <m:r>
+              <m:rPr>
+                <m:sty m:val="b"/>
+              </m:rPr>
+              <m:t>x</m:t>
+            </m:r>
+          </m:e>
+        </m:d>
+      </m:oMath>
+      <w:r>
+        <w:t xml:space="preserve"> </w:t>
+      </w:r>
+      <w:r>
+        <w:t xml:space="preserve">是注意力输出，</w:t>
+      </w:r>
+      <m:oMath>
+        <m:r>
+          <m:rPr>
+            <m:sty m:val="b"/>
+          </m:rPr>
+          <m:t>y</m:t>
+        </m:r>
+      </m:oMath>
+      <w:r>
+        <w:t xml:space="preserve"> </w:t>
+      </w:r>
+      <w:r>
+        <w:t xml:space="preserve">是第一次 LayerNorm 之后的表示，</w:t>
+      </w:r>
+      <m:oMath>
+        <m:r>
+          <m:rPr>
+            <m:sty m:val="p"/>
+          </m:rPr>
+          <m:t>F</m:t>
+        </m:r>
+        <m:r>
+          <m:rPr>
+            <m:sty m:val="p"/>
+          </m:rPr>
+          <m:t>F</m:t>
+        </m:r>
+        <m:r>
+          <m:rPr>
+            <m:sty m:val="p"/>
+          </m:rPr>
+          <m:t>N</m:t>
+        </m:r>
+        <m:d>
+          <m:dPr>
+            <m:begChr m:val="("/>
+            <m:endChr m:val=")"/>
+            <m:sepChr m:val=""/>
+            <m:grow/>
+          </m:dPr>
+          <m:e>
+            <m:r>
+              <m:rPr>
+                <m:sty m:val="b"/>
+              </m:rPr>
+              <m:t>y</m:t>
+            </m:r>
+          </m:e>
+        </m:d>
+      </m:oMath>
+      <w:r>
+        <w:t xml:space="preserve"> </w:t>
+      </w:r>
+      <w:r>
+        <w:t xml:space="preserve">是前馈输出，</w:t>
+      </w:r>
+      <m:oMath>
+        <m:r>
+          <m:rPr>
+            <m:sty m:val="b"/>
+          </m:rPr>
+          <m:t>z</m:t>
+        </m:r>
+      </m:oMath>
+      <w:r>
+        <w:t xml:space="preserve"> </w:t>
+      </w:r>
+      <w:r>
+        <w:t xml:space="preserve">交给下一层。注意力先做联合 QKV 投影。</w:t>
       </w:r>
       <m:oMath>
         <m:rad>

</xml_diff>

<commit_message>
Place each symbol explanation directly under its formula.
The opening notation list is removed so every display equation is followed by the meaning of its own letters.

Co-authored-by: Tryrail4510471 <Tryrail4510471@users.noreply.github.com>
</commit_message>
<xml_diff>
--- a/paper/midterm_section2_progress.docx
+++ b/paper/midterm_section2_progress.docx
@@ -16,918 +16,7 @@
         <w:pStyle w:val="FirstParagraph"/>
       </w:pPr>
       <w:r>
-        <w:t xml:space="preserve">研究按「先实现算子，再逐级拼成 BERT-base，最后用实验逐级论证」推进。公开 BERT-base 的前向被拆成输入嵌入、私有矩阵乘、Softmax、GELU、LayerNorm，再由这些算子组成注意力、前馈网络、Pooler 和分类头。三台 NVIDIA A10 上使用 hpmpc 的 Trio 半诚实三方协议。权重保持为算术分享，token 编号和 padding 掩码对三方公开，中间激活不还原，最后只揭示两个 logit。下面先说明各算子的实现，再按同一顺序给出实验结果。</w:t>
-      </w:r>
-    </w:p>
-    <w:p>
-      <w:pPr>
-        <w:pStyle w:val="BodyText"/>
-      </w:pPr>
-      <w:r>
-        <w:t xml:space="preserve">后文公式里的字母按这个含义使用。</w:t>
-      </w:r>
-      <m:oMath>
-        <m:sSub>
-          <m:e>
-            <m:r>
-              <m:t>P</m:t>
-            </m:r>
-          </m:e>
-          <m:sub>
-            <m:r>
-              <m:t>0</m:t>
-            </m:r>
-          </m:sub>
-        </m:sSub>
-      </m:oMath>
-      <w:r>
-        <w:t xml:space="preserve"> </w:t>
-      </w:r>
-      <w:r>
-        <w:t xml:space="preserve">是保存明文权重的模型所有者，</w:t>
-      </w:r>
-      <m:oMath>
-        <m:sSub>
-          <m:e>
-            <m:r>
-              <m:t>P</m:t>
-            </m:r>
-          </m:e>
-          <m:sub>
-            <m:r>
-              <m:t>1</m:t>
-            </m:r>
-          </m:sub>
-        </m:sSub>
-      </m:oMath>
-      <w:r>
-        <w:t xml:space="preserve"> </w:t>
-      </w:r>
-      <w:r>
-        <w:t xml:space="preserve">和</w:t>
-      </w:r>
-      <w:r>
-        <w:t xml:space="preserve"> </w:t>
-      </w:r>
-      <m:oMath>
-        <m:sSub>
-          <m:e>
-            <m:r>
-              <m:t>P</m:t>
-            </m:r>
-          </m:e>
-          <m:sub>
-            <m:r>
-              <m:t>2</m:t>
-            </m:r>
-          </m:sub>
-        </m:sSub>
-      </m:oMath>
-      <w:r>
-        <w:t xml:space="preserve"> </w:t>
-      </w:r>
-      <w:r>
-        <w:t xml:space="preserve">是另外两方。</w:t>
-      </w:r>
-      <m:oMath>
-        <m:r>
-          <m:t>B</m:t>
-        </m:r>
-      </m:oMath>
-      <w:r>
-        <w:t xml:space="preserve"> </w:t>
-      </w:r>
-      <w:r>
-        <w:t xml:space="preserve">是 batch，</w:t>
-      </w:r>
-      <m:oMath>
-        <m:r>
-          <m:t>L</m:t>
-        </m:r>
-      </m:oMath>
-      <w:r>
-        <w:t xml:space="preserve"> </w:t>
-      </w:r>
-      <w:r>
-        <w:t xml:space="preserve">是序列长度，</w:t>
-      </w:r>
-      <m:oMath>
-        <m:r>
-          <m:t>p</m:t>
-        </m:r>
-      </m:oMath>
-      <w:r>
-        <w:t xml:space="preserve"> </w:t>
-      </w:r>
-      <w:r>
-        <w:t xml:space="preserve">是其中一个位置，</w:t>
-      </w:r>
-      <m:oMath>
-        <m:r>
-          <m:t>j</m:t>
-        </m:r>
-      </m:oMath>
-      <w:r>
-        <w:t xml:space="preserve"> </w:t>
-      </w:r>
-      <w:r>
-        <w:t xml:space="preserve">是 768 维里的某一维。</w:t>
-      </w:r>
-      <m:oMath>
-        <m:sSub>
-          <m:e>
-            <m:r>
-              <m:t>t</m:t>
-            </m:r>
-          </m:e>
-          <m:sub>
-            <m:r>
-              <m:t>p</m:t>
-            </m:r>
-          </m:sub>
-        </m:sSub>
-      </m:oMath>
-      <w:r>
-        <w:t xml:space="preserve"> </w:t>
-      </w:r>
-      <w:r>
-        <w:t xml:space="preserve">是位置</w:t>
-      </w:r>
-      <w:r>
-        <w:t xml:space="preserve"> </w:t>
-      </w:r>
-      <m:oMath>
-        <m:r>
-          <m:t>p</m:t>
-        </m:r>
-      </m:oMath>
-      <w:r>
-        <w:t xml:space="preserve"> </w:t>
-      </w:r>
-      <w:r>
-        <w:t xml:space="preserve">的 token 编号，</w:t>
-      </w:r>
-      <m:oMath>
-        <m:sSub>
-          <m:e>
-            <m:r>
-              <m:t>s</m:t>
-            </m:r>
-          </m:e>
-          <m:sub>
-            <m:r>
-              <m:t>p</m:t>
-            </m:r>
-          </m:sub>
-        </m:sSub>
-      </m:oMath>
-      <w:r>
-        <w:t xml:space="preserve"> </w:t>
-      </w:r>
-      <w:r>
-        <w:t xml:space="preserve">是片段编号。</w:t>
-      </w:r>
-      <m:oMath>
-        <m:sSub>
-          <m:e>
-            <m:r>
-              <m:rPr>
-                <m:sty m:val="b"/>
-              </m:rPr>
-              <m:t>E</m:t>
-            </m:r>
-          </m:e>
-          <m:sub>
-            <m:r>
-              <m:rPr>
-                <m:sty m:val="p"/>
-              </m:rPr>
-              <m:t>t</m:t>
-            </m:r>
-            <m:r>
-              <m:rPr>
-                <m:sty m:val="p"/>
-              </m:rPr>
-              <m:t>o</m:t>
-            </m:r>
-            <m:r>
-              <m:rPr>
-                <m:sty m:val="p"/>
-              </m:rPr>
-              <m:t>k</m:t>
-            </m:r>
-          </m:sub>
-        </m:sSub>
-      </m:oMath>
-      <w:r>
-        <w:t xml:space="preserve">、</w:t>
-      </w:r>
-      <m:oMath>
-        <m:sSub>
-          <m:e>
-            <m:r>
-              <m:rPr>
-                <m:sty m:val="b"/>
-              </m:rPr>
-              <m:t>E</m:t>
-            </m:r>
-          </m:e>
-          <m:sub>
-            <m:r>
-              <m:rPr>
-                <m:sty m:val="p"/>
-              </m:rPr>
-              <m:t>p</m:t>
-            </m:r>
-            <m:r>
-              <m:rPr>
-                <m:sty m:val="p"/>
-              </m:rPr>
-              <m:t>o</m:t>
-            </m:r>
-            <m:r>
-              <m:rPr>
-                <m:sty m:val="p"/>
-              </m:rPr>
-              <m:t>s</m:t>
-            </m:r>
-          </m:sub>
-        </m:sSub>
-      </m:oMath>
-      <w:r>
-        <w:t xml:space="preserve">、</w:t>
-      </w:r>
-      <m:oMath>
-        <m:sSub>
-          <m:e>
-            <m:r>
-              <m:rPr>
-                <m:sty m:val="b"/>
-              </m:rPr>
-              <m:t>E</m:t>
-            </m:r>
-          </m:e>
-          <m:sub>
-            <m:r>
-              <m:rPr>
-                <m:sty m:val="p"/>
-              </m:rPr>
-              <m:t>s</m:t>
-            </m:r>
-            <m:r>
-              <m:rPr>
-                <m:sty m:val="p"/>
-              </m:rPr>
-              <m:t>e</m:t>
-            </m:r>
-            <m:r>
-              <m:rPr>
-                <m:sty m:val="p"/>
-              </m:rPr>
-              <m:t>g</m:t>
-            </m:r>
-          </m:sub>
-        </m:sSub>
-      </m:oMath>
-      <w:r>
-        <w:t xml:space="preserve"> </w:t>
-      </w:r>
-      <w:r>
-        <w:t xml:space="preserve">依次是词嵌入、位置嵌入和片段嵌入，</w:t>
-      </w:r>
-      <m:oMath>
-        <m:sSub>
-          <m:e>
-            <m:r>
-              <m:rPr>
-                <m:sty m:val="b"/>
-              </m:rPr>
-              <m:t>u</m:t>
-            </m:r>
-          </m:e>
-          <m:sub>
-            <m:r>
-              <m:t>p</m:t>
-            </m:r>
-          </m:sub>
-        </m:sSub>
-      </m:oMath>
-      <w:r>
-        <w:t xml:space="preserve"> </w:t>
-      </w:r>
-      <w:r>
-        <w:t xml:space="preserve">是三者相加后的向量。</w:t>
-      </w:r>
-      <m:oMath>
-        <m:sSub>
-          <m:e>
-            <m:r>
-              <m:t>μ</m:t>
-            </m:r>
-          </m:e>
-          <m:sub>
-            <m:r>
-              <m:t>p</m:t>
-            </m:r>
-          </m:sub>
-        </m:sSub>
-      </m:oMath>
-      <w:r>
-        <w:t xml:space="preserve"> </w:t>
-      </w:r>
-      <w:r>
-        <w:t xml:space="preserve">和</w:t>
-      </w:r>
-      <w:r>
-        <w:t xml:space="preserve"> </w:t>
-      </w:r>
-      <m:oMath>
-        <m:sSub>
-          <m:e>
-            <m:r>
-              <m:t>v</m:t>
-            </m:r>
-          </m:e>
-          <m:sub>
-            <m:r>
-              <m:t>p</m:t>
-            </m:r>
-          </m:sub>
-        </m:sSub>
-      </m:oMath>
-      <w:r>
-        <w:t xml:space="preserve"> </w:t>
-      </w:r>
-      <w:r>
-        <w:t xml:space="preserve">是该向量的均值和方差，</w:t>
-      </w:r>
-      <m:oMath>
-        <m:r>
-          <m:t>ϵ</m:t>
-        </m:r>
-      </m:oMath>
-      <w:r>
-        <w:t xml:space="preserve"> </w:t>
-      </w:r>
-      <w:r>
-        <w:t xml:space="preserve">是防止除零的小常数，</w:t>
-      </w:r>
-      <m:oMath>
-        <m:sSub>
-          <m:e>
-            <m:r>
-              <m:t>γ</m:t>
-            </m:r>
-          </m:e>
-          <m:sub>
-            <m:r>
-              <m:t>j</m:t>
-            </m:r>
-          </m:sub>
-        </m:sSub>
-      </m:oMath>
-      <w:r>
-        <w:t xml:space="preserve"> </w:t>
-      </w:r>
-      <w:r>
-        <w:t xml:space="preserve">和</w:t>
-      </w:r>
-      <w:r>
-        <w:t xml:space="preserve"> </w:t>
-      </w:r>
-      <m:oMath>
-        <m:sSub>
-          <m:e>
-            <m:r>
-              <m:t>β</m:t>
-            </m:r>
-          </m:e>
-          <m:sub>
-            <m:r>
-              <m:t>j</m:t>
-            </m:r>
-          </m:sub>
-        </m:sSub>
-      </m:oMath>
-      <w:r>
-        <w:t xml:space="preserve"> </w:t>
-      </w:r>
-      <w:r>
-        <w:t xml:space="preserve">是 LayerNorm 的缩放与平移，</w:t>
-      </w:r>
-      <m:oMath>
-        <m:sSub>
-          <m:e>
-            <m:r>
-              <m:t>h</m:t>
-            </m:r>
-          </m:e>
-          <m:sub>
-            <m:r>
-              <m:t>p</m:t>
-            </m:r>
-            <m:r>
-              <m:rPr>
-                <m:sty m:val="p"/>
-              </m:rPr>
-              <m:t>,</m:t>
-            </m:r>
-            <m:r>
-              <m:t>j</m:t>
-            </m:r>
-          </m:sub>
-        </m:sSub>
-      </m:oMath>
-      <w:r>
-        <w:t xml:space="preserve"> </w:t>
-      </w:r>
-      <w:r>
-        <w:t xml:space="preserve">是归一化后的第</w:t>
-      </w:r>
-      <w:r>
-        <w:t xml:space="preserve"> </w:t>
-      </w:r>
-      <m:oMath>
-        <m:r>
-          <m:t>j</m:t>
-        </m:r>
-      </m:oMath>
-      <w:r>
-        <w:t xml:space="preserve"> </w:t>
-      </w:r>
-      <w:r>
-        <w:t xml:space="preserve">维。</w:t>
-      </w:r>
-      <m:oMath>
-        <m:r>
-          <m:rPr>
-            <m:sty m:val="p"/>
-          </m:rPr>
-          <m:t>⟨</m:t>
-        </m:r>
-        <m:r>
-          <m:t>x</m:t>
-        </m:r>
-        <m:sSup>
-          <m:e>
-            <m:r>
-              <m:rPr>
-                <m:sty m:val="p"/>
-              </m:rPr>
-              <m:t>⟩</m:t>
-            </m:r>
-          </m:e>
-          <m:sup>
-            <m:r>
-              <m:t>A</m:t>
-            </m:r>
-          </m:sup>
-        </m:sSup>
-      </m:oMath>
-      <w:r>
-        <w:t xml:space="preserve"> </w:t>
-      </w:r>
-      <w:r>
-        <w:t xml:space="preserve">表示数</w:t>
-      </w:r>
-      <w:r>
-        <w:t xml:space="preserve"> </w:t>
-      </w:r>
-      <m:oMath>
-        <m:r>
-          <m:t>x</m:t>
-        </m:r>
-      </m:oMath>
-      <w:r>
-        <w:t xml:space="preserve"> </w:t>
-      </w:r>
-      <w:r>
-        <w:t xml:space="preserve">的算术分享，</w:t>
-      </w:r>
-      <m:oMath>
-        <m:r>
-          <m:rPr>
-            <m:sty m:val="p"/>
-          </m:rPr>
-          <m:t>⟨</m:t>
-        </m:r>
-        <m:r>
-          <m:t>x</m:t>
-        </m:r>
-        <m:sSup>
-          <m:e>
-            <m:r>
-              <m:rPr>
-                <m:sty m:val="p"/>
-              </m:rPr>
-              <m:t>⟩</m:t>
-            </m:r>
-          </m:e>
-          <m:sup>
-            <m:r>
-              <m:t>B</m:t>
-            </m:r>
-          </m:sup>
-        </m:sSup>
-      </m:oMath>
-      <w:r>
-        <w:t xml:space="preserve"> </w:t>
-      </w:r>
-      <w:r>
-        <w:t xml:space="preserve">表示布尔分享。定点数</w:t>
-      </w:r>
-      <w:r>
-        <w:t xml:space="preserve"> </w:t>
-      </w:r>
-      <m:oMath>
-        <m:r>
-          <m:t>a</m:t>
-        </m:r>
-      </m:oMath>
-      <w:r>
-        <w:t xml:space="preserve"> </w:t>
-      </w:r>
-      <w:r>
-        <w:t xml:space="preserve">拆成高 10 位</w:t>
-      </w:r>
-      <w:r>
-        <w:t xml:space="preserve"> </w:t>
-      </w:r>
-      <m:oMath>
-        <m:sSub>
-          <m:e>
-            <m:r>
-              <m:t>a</m:t>
-            </m:r>
-          </m:e>
-          <m:sub>
-            <m:r>
-              <m:t>h</m:t>
-            </m:r>
-          </m:sub>
-        </m:sSub>
-      </m:oMath>
-      <w:r>
-        <w:t xml:space="preserve"> </w:t>
-      </w:r>
-      <w:r>
-        <w:t xml:space="preserve">和低 10 位</w:t>
-      </w:r>
-      <w:r>
-        <w:t xml:space="preserve"> </w:t>
-      </w:r>
-      <m:oMath>
-        <m:sSub>
-          <m:e>
-            <m:r>
-              <m:t>a</m:t>
-            </m:r>
-          </m:e>
-          <m:sub>
-            <m:r>
-              <m:t>l</m:t>
-            </m:r>
-          </m:sub>
-        </m:sSub>
-      </m:oMath>
-      <w:r>
-        <w:t xml:space="preserve">。Softmax 里，</w:t>
-      </w:r>
-      <m:oMath>
-        <m:sSub>
-          <m:e>
-            <m:r>
-              <m:t>x</m:t>
-            </m:r>
-          </m:e>
-          <m:sub>
-            <m:r>
-              <m:t>i</m:t>
-            </m:r>
-          </m:sub>
-        </m:sSub>
-      </m:oMath>
-      <w:r>
-        <w:t xml:space="preserve"> </w:t>
-      </w:r>
-      <w:r>
-        <w:t xml:space="preserve">是一行中第</w:t>
-      </w:r>
-      <w:r>
-        <w:t xml:space="preserve"> </w:t>
-      </w:r>
-      <m:oMath>
-        <m:r>
-          <m:t>i</m:t>
-        </m:r>
-      </m:oMath>
-      <w:r>
-        <w:t xml:space="preserve"> </w:t>
-      </w:r>
-      <w:r>
-        <w:t xml:space="preserve">个分数，</w:t>
-      </w:r>
-      <m:oMath>
-        <m:r>
-          <m:t>m</m:t>
-        </m:r>
-      </m:oMath>
-      <w:r>
-        <w:t xml:space="preserve"> </w:t>
-      </w:r>
-      <w:r>
-        <w:t xml:space="preserve">是这一行的最大值，</w:t>
-      </w:r>
-      <m:oMath>
-        <m:sSub>
-          <m:e>
-            <m:r>
-              <m:t>p</m:t>
-            </m:r>
-          </m:e>
-          <m:sub>
-            <m:r>
-              <m:t>i</m:t>
-            </m:r>
-          </m:sub>
-        </m:sSub>
-      </m:oMath>
-      <w:r>
-        <w:t xml:space="preserve"> </w:t>
-      </w:r>
-      <w:r>
-        <w:t xml:space="preserve">是归一化权重，</w:t>
-      </w:r>
-      <m:oMath>
-        <m:sSub>
-          <m:e>
-            <m:r>
-              <m:t>δ</m:t>
-            </m:r>
-          </m:e>
-          <m:sub>
-            <m:r>
-              <m:t>i</m:t>
-            </m:r>
-          </m:sub>
-        </m:sSub>
-        <m:r>
-          <m:rPr>
-            <m:sty m:val="p"/>
-          </m:rPr>
-          <m:t>=</m:t>
-        </m:r>
-        <m:sSub>
-          <m:e>
-            <m:r>
-              <m:t>x</m:t>
-            </m:r>
-          </m:e>
-          <m:sub>
-            <m:r>
-              <m:t>i</m:t>
-            </m:r>
-          </m:sub>
-        </m:sSub>
-        <m:r>
-          <m:rPr>
-            <m:sty m:val="p"/>
-          </m:rPr>
-          <m:t>−</m:t>
-        </m:r>
-        <m:r>
-          <m:t>m</m:t>
-        </m:r>
-      </m:oMath>
-      <w:r>
-        <w:t xml:space="preserve">。</w:t>
-      </w:r>
-      <m:oMath>
-        <m:r>
-          <m:t>q</m:t>
-        </m:r>
-      </m:oMath>
-      <w:r>
-        <w:t xml:space="preserve"> </w:t>
-      </w:r>
-      <w:r>
-        <w:t xml:space="preserve">和</w:t>
-      </w:r>
-      <w:r>
-        <w:t xml:space="preserve"> </w:t>
-      </w:r>
-      <m:oMath>
-        <m:r>
-          <m:t>k</m:t>
-        </m:r>
-      </m:oMath>
-      <w:r>
-        <w:t xml:space="preserve"> </w:t>
-      </w:r>
-      <w:r>
-        <w:t xml:space="preserve">是查询向量和键向量，</w:t>
-      </w:r>
-      <m:oMath>
-        <m:r>
-          <m:t>h</m:t>
-        </m:r>
-      </m:oMath>
-      <w:r>
-        <w:t xml:space="preserve"> </w:t>
-      </w:r>
-      <w:r>
-        <w:t xml:space="preserve">是注意力头的编号，</w:t>
-      </w:r>
-      <m:oMath>
-        <m:sSub>
-          <m:e>
-            <m:r>
-              <m:t>m</m:t>
-            </m:r>
-          </m:e>
-          <m:sub>
-            <m:r>
-              <m:t>k</m:t>
-            </m:r>
-          </m:sub>
-        </m:sSub>
-      </m:oMath>
-      <w:r>
-        <w:t xml:space="preserve"> </w:t>
-      </w:r>
-      <w:r>
-        <w:t xml:space="preserve">是加在第</w:t>
-      </w:r>
-      <w:r>
-        <w:t xml:space="preserve"> </w:t>
-      </w:r>
-      <m:oMath>
-        <m:r>
-          <m:t>k</m:t>
-        </m:r>
-      </m:oMath>
-      <w:r>
-        <w:t xml:space="preserve"> </w:t>
-      </w:r>
-      <w:r>
-        <w:t xml:space="preserve">个键上的掩码。倒数公式里的</w:t>
-      </w:r>
-      <w:r>
-        <w:t xml:space="preserve"> </w:t>
-      </w:r>
-      <m:oMath>
-        <m:r>
-          <m:t>s</m:t>
-        </m:r>
-      </m:oMath>
-      <w:r>
-        <w:t xml:space="preserve"> </w:t>
-      </w:r>
-      <w:r>
-        <w:t xml:space="preserve">是一行指数的和，</w:t>
-      </w:r>
-      <m:oMath>
-        <m:r>
-          <m:t>r</m:t>
-        </m:r>
-      </m:oMath>
-      <w:r>
-        <w:t xml:space="preserve"> </w:t>
-      </w:r>
-      <w:r>
-        <w:t xml:space="preserve">是</w:t>
-      </w:r>
-      <w:r>
-        <w:t xml:space="preserve"> </w:t>
-      </w:r>
-      <m:oMath>
-        <m:r>
-          <m:t>1</m:t>
-        </m:r>
-        <m:r>
-          <m:rPr>
-            <m:sty m:val="p"/>
-          </m:rPr>
-          <m:t>/</m:t>
-        </m:r>
-        <m:r>
-          <m:t>s</m:t>
-        </m:r>
-      </m:oMath>
-      <w:r>
-        <w:t xml:space="preserve"> </w:t>
-      </w:r>
-      <w:r>
-        <w:t xml:space="preserve">的近似，</w:t>
-      </w:r>
-      <m:oMath>
-        <m:sSub>
-          <m:e>
-            <m:r>
-              <m:t>b</m:t>
-            </m:r>
-          </m:e>
-          <m:sub>
-            <m:r>
-              <m:t>k</m:t>
-            </m:r>
-          </m:sub>
-        </m:sSub>
-      </m:oMath>
-      <w:r>
-        <w:t xml:space="preserve"> </w:t>
-      </w:r>
-      <w:r>
-        <w:t xml:space="preserve">是区间选择位，</w:t>
-      </w:r>
-      <m:oMath>
-        <m:sSub>
-          <m:e>
-            <m:r>
-              <m:t>α</m:t>
-            </m:r>
-          </m:e>
-          <m:sub>
-            <m:r>
-              <m:t>k</m:t>
-            </m:r>
-          </m:sub>
-        </m:sSub>
-      </m:oMath>
-      <w:r>
-        <w:t xml:space="preserve"> </w:t>
-      </w:r>
-      <w:r>
-        <w:t xml:space="preserve">和</w:t>
-      </w:r>
-      <w:r>
-        <w:t xml:space="preserve"> </w:t>
-      </w:r>
-      <m:oMath>
-        <m:sSub>
-          <m:e>
-            <m:r>
-              <m:t>β</m:t>
-            </m:r>
-          </m:e>
-          <m:sub>
-            <m:r>
-              <m:t>k</m:t>
-            </m:r>
-          </m:sub>
-        </m:sSub>
-      </m:oMath>
-      <w:r>
-        <w:t xml:space="preserve"> </w:t>
-      </w:r>
-      <w:r>
-        <w:t xml:space="preserve">是公开种子系数；这里的</w:t>
-      </w:r>
-      <w:r>
-        <w:t xml:space="preserve"> </w:t>
-      </w:r>
-      <m:oMath>
-        <m:sSub>
-          <m:e>
-            <m:r>
-              <m:t>β</m:t>
-            </m:r>
-          </m:e>
-          <m:sub>
-            <m:r>
-              <m:t>k</m:t>
-            </m:r>
-          </m:sub>
-        </m:sSub>
-      </m:oMath>
-      <w:r>
-        <w:t xml:space="preserve"> </w:t>
-      </w:r>
-      <w:r>
-        <w:t xml:space="preserve">与 LayerNorm 的</w:t>
-      </w:r>
-      <w:r>
-        <w:t xml:space="preserve"> </w:t>
-      </w:r>
-      <m:oMath>
-        <m:sSub>
-          <m:e>
-            <m:r>
-              <m:t>β</m:t>
-            </m:r>
-          </m:e>
-          <m:sub>
-            <m:r>
-              <m:t>j</m:t>
-            </m:r>
-          </m:sub>
-        </m:sSub>
-      </m:oMath>
-      <w:r>
-        <w:t xml:space="preserve"> </w:t>
-      </w:r>
-      <w:r>
-        <w:t xml:space="preserve">不是同一个量。</w:t>
+        <w:t xml:space="preserve">研究按「先实现算子，再逐级拼成 BERT-base，最后用实验逐级论证」推进。公开 BERT-base 的前向被拆成输入嵌入、私有矩阵乘、Softmax、GELU、LayerNorm，再由这些算子组成注意力、前馈网络、Pooler 和分类头。三台 NVIDIA A10 上使用 hpmpc 的 Trio 半诚实三方协议。权重保持为算术分享，token 编号和 padding 掩码对三方公开，中间激活不还原，最后只揭示两个 logit。下面先说明各算子的实现，再按同一顺序给出实验结果。每条公式下面解释该式中的字母。</w:t>
       </w:r>
     </w:p>
     <w:bookmarkStart w:id="27" w:name="一各算子的实现方式"/>
@@ -1248,6 +337,133 @@
         <w:pStyle w:val="FirstParagraph"/>
       </w:pPr>
       <w:r>
+        <w:t xml:space="preserve">式中，</w:t>
+      </w:r>
+      <m:oMath>
+        <m:r>
+          <m:t>x</m:t>
+        </m:r>
+      </m:oMath>
+      <w:r>
+        <w:t xml:space="preserve"> </w:t>
+      </w:r>
+      <w:r>
+        <w:t xml:space="preserve">是原来的实数，</w:t>
+      </w:r>
+      <m:oMath>
+        <m:acc>
+          <m:accPr>
+            <m:chr m:val="̃"/>
+          </m:accPr>
+          <m:e>
+            <m:r>
+              <m:t>x</m:t>
+            </m:r>
+          </m:e>
+        </m:acc>
+      </m:oMath>
+      <w:r>
+        <w:t xml:space="preserve"> </w:t>
+      </w:r>
+      <w:r>
+        <w:t xml:space="preserve">是写进 32 位环的整数。</w:t>
+      </w:r>
+      <m:oMath>
+        <m:sSup>
+          <m:e>
+            <m:r>
+              <m:t>2</m:t>
+            </m:r>
+          </m:e>
+          <m:sup>
+            <m:r>
+              <m:t>20</m:t>
+            </m:r>
+          </m:sup>
+        </m:sSup>
+      </m:oMath>
+      <w:r>
+        <w:t xml:space="preserve"> </w:t>
+      </w:r>
+      <w:r>
+        <w:t xml:space="preserve">把小数点左移 20 位，</w:t>
+      </w:r>
+      <m:oMath>
+        <m:r>
+          <m:rPr>
+            <m:sty m:val="p"/>
+          </m:rPr>
+          <m:t>r</m:t>
+        </m:r>
+        <m:r>
+          <m:rPr>
+            <m:sty m:val="p"/>
+          </m:rPr>
+          <m:t>o</m:t>
+        </m:r>
+        <m:r>
+          <m:rPr>
+            <m:sty m:val="p"/>
+          </m:rPr>
+          <m:t>u</m:t>
+        </m:r>
+        <m:r>
+          <m:rPr>
+            <m:sty m:val="p"/>
+          </m:rPr>
+          <m:t>n</m:t>
+        </m:r>
+        <m:r>
+          <m:rPr>
+            <m:sty m:val="p"/>
+          </m:rPr>
+          <m:t>d</m:t>
+        </m:r>
+      </m:oMath>
+      <w:r>
+        <w:t xml:space="preserve"> </w:t>
+      </w:r>
+      <w:r>
+        <w:t xml:space="preserve">表示四舍五入，</w:t>
+      </w:r>
+      <m:oMath>
+        <m:r>
+          <m:t> </m:t>
+        </m:r>
+        <m:r>
+          <m:rPr>
+            <m:sty m:val="p"/>
+          </m:rPr>
+          <m:t>mod</m:t>
+        </m:r>
+        <m:r>
+          <m:t> </m:t>
+        </m:r>
+        <m:sSup>
+          <m:e>
+            <m:r>
+              <m:t>2</m:t>
+            </m:r>
+          </m:e>
+          <m:sup>
+            <m:r>
+              <m:t>32</m:t>
+            </m:r>
+          </m:sup>
+        </m:sSup>
+      </m:oMath>
+      <w:r>
+        <w:t xml:space="preserve"> </w:t>
+      </w:r>
+      <w:r>
+        <w:t xml:space="preserve">表示结果只保留 32 位。</w:t>
+      </w:r>
+    </w:p>
+    <w:p>
+      <w:pPr>
+        <w:pStyle w:val="BodyText"/>
+      </w:pPr>
+      <w:r>
         <w:rPr>
           <w:rStyle w:val="VerbatimChar"/>
         </w:rPr>
@@ -1562,6 +778,196 @@
     <w:p>
       <w:pPr>
         <w:pStyle w:val="FirstParagraph"/>
+      </w:pPr>
+      <w:r>
+        <w:t xml:space="preserve">式中，</w:t>
+      </w:r>
+      <m:oMath>
+        <m:r>
+          <m:t>p</m:t>
+        </m:r>
+      </m:oMath>
+      <w:r>
+        <w:t xml:space="preserve"> </w:t>
+      </w:r>
+      <w:r>
+        <w:t xml:space="preserve">是序列中的位置，</w:t>
+      </w:r>
+      <m:oMath>
+        <m:sSub>
+          <m:e>
+            <m:r>
+              <m:t>t</m:t>
+            </m:r>
+          </m:e>
+          <m:sub>
+            <m:r>
+              <m:t>p</m:t>
+            </m:r>
+          </m:sub>
+        </m:sSub>
+      </m:oMath>
+      <w:r>
+        <w:t xml:space="preserve"> </w:t>
+      </w:r>
+      <w:r>
+        <w:t xml:space="preserve">是这个位置的 token 编号，</w:t>
+      </w:r>
+      <m:oMath>
+        <m:sSub>
+          <m:e>
+            <m:r>
+              <m:t>s</m:t>
+            </m:r>
+          </m:e>
+          <m:sub>
+            <m:r>
+              <m:t>p</m:t>
+            </m:r>
+          </m:sub>
+        </m:sSub>
+      </m:oMath>
+      <w:r>
+        <w:t xml:space="preserve"> </w:t>
+      </w:r>
+      <w:r>
+        <w:t xml:space="preserve">是片段编号。</w:t>
+      </w:r>
+      <m:oMath>
+        <m:sSub>
+          <m:e>
+            <m:r>
+              <m:rPr>
+                <m:sty m:val="b"/>
+              </m:rPr>
+              <m:t>E</m:t>
+            </m:r>
+          </m:e>
+          <m:sub>
+            <m:r>
+              <m:rPr>
+                <m:sty m:val="p"/>
+              </m:rPr>
+              <m:t>t</m:t>
+            </m:r>
+            <m:r>
+              <m:rPr>
+                <m:sty m:val="p"/>
+              </m:rPr>
+              <m:t>o</m:t>
+            </m:r>
+            <m:r>
+              <m:rPr>
+                <m:sty m:val="p"/>
+              </m:rPr>
+              <m:t>k</m:t>
+            </m:r>
+          </m:sub>
+        </m:sSub>
+      </m:oMath>
+      <w:r>
+        <w:t xml:space="preserve">、</w:t>
+      </w:r>
+      <m:oMath>
+        <m:sSub>
+          <m:e>
+            <m:r>
+              <m:rPr>
+                <m:sty m:val="b"/>
+              </m:rPr>
+              <m:t>E</m:t>
+            </m:r>
+          </m:e>
+          <m:sub>
+            <m:r>
+              <m:rPr>
+                <m:sty m:val="p"/>
+              </m:rPr>
+              <m:t>p</m:t>
+            </m:r>
+            <m:r>
+              <m:rPr>
+                <m:sty m:val="p"/>
+              </m:rPr>
+              <m:t>o</m:t>
+            </m:r>
+            <m:r>
+              <m:rPr>
+                <m:sty m:val="p"/>
+              </m:rPr>
+              <m:t>s</m:t>
+            </m:r>
+          </m:sub>
+        </m:sSub>
+      </m:oMath>
+      <w:r>
+        <w:t xml:space="preserve">、</w:t>
+      </w:r>
+      <m:oMath>
+        <m:sSub>
+          <m:e>
+            <m:r>
+              <m:rPr>
+                <m:sty m:val="b"/>
+              </m:rPr>
+              <m:t>E</m:t>
+            </m:r>
+          </m:e>
+          <m:sub>
+            <m:r>
+              <m:rPr>
+                <m:sty m:val="p"/>
+              </m:rPr>
+              <m:t>s</m:t>
+            </m:r>
+            <m:r>
+              <m:rPr>
+                <m:sty m:val="p"/>
+              </m:rPr>
+              <m:t>e</m:t>
+            </m:r>
+            <m:r>
+              <m:rPr>
+                <m:sty m:val="p"/>
+              </m:rPr>
+              <m:t>g</m:t>
+            </m:r>
+          </m:sub>
+        </m:sSub>
+      </m:oMath>
+      <w:r>
+        <w:t xml:space="preserve"> </w:t>
+      </w:r>
+      <w:r>
+        <w:t xml:space="preserve">分别是词嵌入表、位置嵌入表和片段嵌入表。</w:t>
+      </w:r>
+      <m:oMath>
+        <m:sSub>
+          <m:e>
+            <m:r>
+              <m:rPr>
+                <m:sty m:val="b"/>
+              </m:rPr>
+              <m:t>u</m:t>
+            </m:r>
+          </m:e>
+          <m:sub>
+            <m:r>
+              <m:t>p</m:t>
+            </m:r>
+          </m:sub>
+        </m:sSub>
+      </m:oMath>
+      <w:r>
+        <w:t xml:space="preserve"> </w:t>
+      </w:r>
+      <w:r>
+        <w:t xml:space="preserve">是查到的三行相加后的 768 维向量。</w:t>
+      </w:r>
+    </w:p>
+    <w:p>
+      <w:pPr>
+        <w:pStyle w:val="BodyText"/>
       </w:pPr>
       <w:r>
         <w:t xml:space="preserve">协议只分享这个 768 维的和，以及 LayerNorm 的私有</w:t>
@@ -1980,6 +1386,207 @@
     <w:p>
       <w:pPr>
         <w:pStyle w:val="FirstParagraph"/>
+      </w:pPr>
+      <w:r>
+        <w:t xml:space="preserve">式中，</w:t>
+      </w:r>
+      <m:oMath>
+        <m:r>
+          <m:t>a</m:t>
+        </m:r>
+      </m:oMath>
+      <w:r>
+        <w:t xml:space="preserve"> </w:t>
+      </w:r>
+      <w:r>
+        <w:t xml:space="preserve">和</w:t>
+      </w:r>
+      <w:r>
+        <w:t xml:space="preserve"> </w:t>
+      </w:r>
+      <m:oMath>
+        <m:r>
+          <m:t>b</m:t>
+        </m:r>
+      </m:oMath>
+      <w:r>
+        <w:t xml:space="preserve"> </w:t>
+      </w:r>
+      <w:r>
+        <w:t xml:space="preserve">是两个 Q12.20 定点数。</w:t>
+      </w:r>
+      <m:oMath>
+        <m:sSub>
+          <m:e>
+            <m:r>
+              <m:t>a</m:t>
+            </m:r>
+          </m:e>
+          <m:sub>
+            <m:r>
+              <m:t>h</m:t>
+            </m:r>
+          </m:sub>
+        </m:sSub>
+      </m:oMath>
+      <w:r>
+        <w:t xml:space="preserve">、</w:t>
+      </w:r>
+      <m:oMath>
+        <m:sSub>
+          <m:e>
+            <m:r>
+              <m:t>b</m:t>
+            </m:r>
+          </m:e>
+          <m:sub>
+            <m:r>
+              <m:t>h</m:t>
+            </m:r>
+          </m:sub>
+        </m:sSub>
+      </m:oMath>
+      <w:r>
+        <w:t xml:space="preserve"> </w:t>
+      </w:r>
+      <w:r>
+        <w:t xml:space="preserve">是各自的高 10 位，</w:t>
+      </w:r>
+      <m:oMath>
+        <m:sSub>
+          <m:e>
+            <m:r>
+              <m:t>a</m:t>
+            </m:r>
+          </m:e>
+          <m:sub>
+            <m:r>
+              <m:t>l</m:t>
+            </m:r>
+          </m:sub>
+        </m:sSub>
+      </m:oMath>
+      <w:r>
+        <w:t xml:space="preserve">、</w:t>
+      </w:r>
+      <m:oMath>
+        <m:sSub>
+          <m:e>
+            <m:r>
+              <m:t>b</m:t>
+            </m:r>
+          </m:e>
+          <m:sub>
+            <m:r>
+              <m:t>l</m:t>
+            </m:r>
+          </m:sub>
+        </m:sSub>
+      </m:oMath>
+      <w:r>
+        <w:t xml:space="preserve"> </w:t>
+      </w:r>
+      <w:r>
+        <w:t xml:space="preserve">是低 10 位。</w:t>
+      </w:r>
+      <m:oMath>
+        <m:sSub>
+          <m:e>
+            <m:r>
+              <m:rPr>
+                <m:sty m:val="p"/>
+              </m:rPr>
+              <m:t>T</m:t>
+            </m:r>
+            <m:r>
+              <m:rPr>
+                <m:sty m:val="p"/>
+              </m:rPr>
+              <m:t>r</m:t>
+            </m:r>
+            <m:r>
+              <m:rPr>
+                <m:sty m:val="p"/>
+              </m:rPr>
+              <m:t>u</m:t>
+            </m:r>
+            <m:r>
+              <m:rPr>
+                <m:sty m:val="p"/>
+              </m:rPr>
+              <m:t>n</m:t>
+            </m:r>
+            <m:r>
+              <m:rPr>
+                <m:sty m:val="p"/>
+              </m:rPr>
+              <m:t>c</m:t>
+            </m:r>
+          </m:e>
+          <m:sub>
+            <m:r>
+              <m:t>20</m:t>
+            </m:r>
+          </m:sub>
+        </m:sSub>
+      </m:oMath>
+      <w:r>
+        <w:t xml:space="preserve"> </w:t>
+      </w:r>
+      <w:r>
+        <w:t xml:space="preserve">表示右移 20 位，</w:t>
+      </w:r>
+      <m:oMath>
+        <m:sSub>
+          <m:e>
+            <m:r>
+              <m:rPr>
+                <m:sty m:val="p"/>
+              </m:rPr>
+              <m:t>T</m:t>
+            </m:r>
+            <m:r>
+              <m:rPr>
+                <m:sty m:val="p"/>
+              </m:rPr>
+              <m:t>r</m:t>
+            </m:r>
+            <m:r>
+              <m:rPr>
+                <m:sty m:val="p"/>
+              </m:rPr>
+              <m:t>u</m:t>
+            </m:r>
+            <m:r>
+              <m:rPr>
+                <m:sty m:val="p"/>
+              </m:rPr>
+              <m:t>n</m:t>
+            </m:r>
+            <m:r>
+              <m:rPr>
+                <m:sty m:val="p"/>
+              </m:rPr>
+              <m:t>c</m:t>
+            </m:r>
+          </m:e>
+          <m:sub>
+            <m:r>
+              <m:t>10</m:t>
+            </m:r>
+          </m:sub>
+        </m:sSub>
+      </m:oMath>
+      <w:r>
+        <w:t xml:space="preserve"> </w:t>
+      </w:r>
+      <w:r>
+        <w:t xml:space="preserve">表示右移 10 位。</w:t>
+      </w:r>
+    </w:p>
+    <w:p>
+      <w:pPr>
+        <w:pStyle w:val="BodyText"/>
       </w:pPr>
       <w:r>
         <w:t xml:space="preserve">低位与低位的乘积不到一个输出最低位，直接舍去。右移使用精确截断，内部是算术转布尔、布尔加法和布尔转算术。权重由</w:t>
@@ -2350,6 +1957,132 @@
         <w:pStyle w:val="FirstParagraph"/>
       </w:pPr>
       <w:r>
+        <w:t xml:space="preserve">式中，</w:t>
+      </w:r>
+      <m:oMath>
+        <m:sSub>
+          <m:e>
+            <m:r>
+              <m:t>x</m:t>
+            </m:r>
+          </m:e>
+          <m:sub>
+            <m:r>
+              <m:t>i</m:t>
+            </m:r>
+          </m:sub>
+        </m:sSub>
+      </m:oMath>
+      <w:r>
+        <w:t xml:space="preserve"> </w:t>
+      </w:r>
+      <w:r>
+        <w:t xml:space="preserve">是一行里第</w:t>
+      </w:r>
+      <w:r>
+        <w:t xml:space="preserve"> </w:t>
+      </w:r>
+      <m:oMath>
+        <m:r>
+          <m:t>i</m:t>
+        </m:r>
+      </m:oMath>
+      <w:r>
+        <w:t xml:space="preserve"> </w:t>
+      </w:r>
+      <w:r>
+        <w:t xml:space="preserve">个注意力分数，</w:t>
+      </w:r>
+      <m:oMath>
+        <m:r>
+          <m:t>L</m:t>
+        </m:r>
+      </m:oMath>
+      <w:r>
+        <w:t xml:space="preserve"> </w:t>
+      </w:r>
+      <w:r>
+        <w:t xml:space="preserve">是这一行的长度。</w:t>
+      </w:r>
+      <m:oMath>
+        <m:r>
+          <m:t>m</m:t>
+        </m:r>
+      </m:oMath>
+      <w:r>
+        <w:t xml:space="preserve"> </w:t>
+      </w:r>
+      <w:r>
+        <w:t xml:space="preserve">是该行最大值。</w:t>
+      </w:r>
+      <m:oMath>
+        <m:sSub>
+          <m:e>
+            <m:r>
+              <m:t>p</m:t>
+            </m:r>
+          </m:e>
+          <m:sub>
+            <m:r>
+              <m:t>i</m:t>
+            </m:r>
+          </m:sub>
+        </m:sSub>
+      </m:oMath>
+      <w:r>
+        <w:t xml:space="preserve"> </w:t>
+      </w:r>
+      <w:r>
+        <w:t xml:space="preserve">是归一化后的第</w:t>
+      </w:r>
+      <w:r>
+        <w:t xml:space="preserve"> </w:t>
+      </w:r>
+      <m:oMath>
+        <m:r>
+          <m:t>i</m:t>
+        </m:r>
+      </m:oMath>
+      <w:r>
+        <w:t xml:space="preserve"> </w:t>
+      </w:r>
+      <w:r>
+        <w:t xml:space="preserve">个权重，</w:t>
+      </w:r>
+      <m:oMath>
+        <m:r>
+          <m:rPr>
+            <m:sty m:val="p"/>
+          </m:rPr>
+          <m:t>exp</m:t>
+        </m:r>
+      </m:oMath>
+      <w:r>
+        <w:t xml:space="preserve"> </w:t>
+      </w:r>
+      <w:r>
+        <w:t xml:space="preserve">表示指数。下标</w:t>
+      </w:r>
+      <w:r>
+        <w:t xml:space="preserve"> </w:t>
+      </w:r>
+      <m:oMath>
+        <m:r>
+          <m:t>j</m:t>
+        </m:r>
+      </m:oMath>
+      <w:r>
+        <w:t xml:space="preserve"> </w:t>
+      </w:r>
+      <w:r>
+        <w:t xml:space="preserve">用来遍历这一行。</w:t>
+      </w:r>
+    </w:p>
+    <w:p>
+      <w:pPr>
+        <w:pStyle w:val="BodyText"/>
+      </w:pPr>
+      <w:r>
         <w:t xml:space="preserve">实现保持输入输出都是算术分享，并分成五个子协议。</w:t>
       </w:r>
     </w:p>
@@ -2607,6 +2340,64 @@
         <w:pStyle w:val="FirstParagraph"/>
       </w:pPr>
       <w:r>
+        <w:t xml:space="preserve">式中，</w:t>
+      </w:r>
+      <m:oMath>
+        <m:r>
+          <m:t>a</m:t>
+        </m:r>
+      </m:oMath>
+      <w:r>
+        <w:t xml:space="preserve"> </w:t>
+      </w:r>
+      <w:r>
+        <w:t xml:space="preserve">和</w:t>
+      </w:r>
+      <w:r>
+        <w:t xml:space="preserve"> </w:t>
+      </w:r>
+      <m:oMath>
+        <m:r>
+          <m:t>b</m:t>
+        </m:r>
+      </m:oMath>
+      <w:r>
+        <w:t xml:space="preserve"> </w:t>
+      </w:r>
+      <w:r>
+        <w:t xml:space="preserve">是待比较的两个数，</w:t>
+      </w:r>
+      <m:oMath>
+        <m:r>
+          <m:t>c</m:t>
+        </m:r>
+      </m:oMath>
+      <w:r>
+        <w:t xml:space="preserve"> </w:t>
+      </w:r>
+      <w:r>
+        <w:t xml:space="preserve">是比较得到的 0 或 1。尖括号表示该值以分享形式存在，上标</w:t>
+      </w:r>
+      <w:r>
+        <w:t xml:space="preserve"> </w:t>
+      </w:r>
+      <m:oMath>
+        <m:r>
+          <m:t>A</m:t>
+        </m:r>
+      </m:oMath>
+      <w:r>
+        <w:t xml:space="preserve"> </w:t>
+      </w:r>
+      <w:r>
+        <w:t xml:space="preserve">表示算术分享。</w:t>
+      </w:r>
+    </w:p>
+    <w:p>
+      <w:pPr>
+        <w:pStyle w:val="BodyText"/>
+      </w:pPr>
+      <w:r>
         <w:t xml:space="preserve">中心化</w:t>
       </w:r>
       <w:r>
@@ -2729,6 +2520,40 @@
       </m:oMath>
       <w:r>
         <w:t xml:space="preserve">。</w:t>
+      </w:r>
+      <m:oMath>
+        <m:sSub>
+          <m:e>
+            <m:r>
+              <m:t>δ</m:t>
+            </m:r>
+          </m:e>
+          <m:sub>
+            <m:r>
+              <m:t>i</m:t>
+            </m:r>
+          </m:sub>
+        </m:sSub>
+      </m:oMath>
+      <w:r>
+        <w:t xml:space="preserve"> </w:t>
+      </w:r>
+      <w:r>
+        <w:t xml:space="preserve">是第</w:t>
+      </w:r>
+      <w:r>
+        <w:t xml:space="preserve"> </w:t>
+      </w:r>
+      <m:oMath>
+        <m:r>
+          <m:t>i</m:t>
+        </m:r>
+      </m:oMath>
+      <w:r>
+        <w:t xml:space="preserve"> </w:t>
+      </w:r>
+      <w:r>
+        <w:t xml:space="preserve">个分数减去该行最大值后的结果。</w:t>
       </w:r>
     </w:p>
     <w:p>
@@ -2951,10 +2776,7 @@
         <w:pStyle w:val="FirstParagraph"/>
       </w:pPr>
       <w:r>
-        <w:t xml:space="preserve">这里的</w:t>
-      </w:r>
-      <w:r>
-        <w:t xml:space="preserve"> </w:t>
+        <w:t xml:space="preserve">式中，</w:t>
       </w:r>
       <m:oMath>
         <m:r>
@@ -2983,6 +2805,33 @@
             </m:r>
           </m:sub>
         </m:sSub>
+        <m:r>
+          <m:rPr>
+            <m:sty m:val="p"/>
+          </m:rPr>
+          <m:t>=</m:t>
+        </m:r>
+        <m:sSub>
+          <m:e>
+            <m:r>
+              <m:t>x</m:t>
+            </m:r>
+          </m:e>
+          <m:sub>
+            <m:r>
+              <m:t>i</m:t>
+            </m:r>
+          </m:sub>
+        </m:sSub>
+        <m:r>
+          <m:rPr>
+            <m:sty m:val="p"/>
+          </m:rPr>
+          <m:t>−</m:t>
+        </m:r>
+        <m:r>
+          <m:t>m</m:t>
+        </m:r>
       </m:oMath>
       <w:r>
         <w:t xml:space="preserve"> </w:t>
@@ -3021,7 +2870,7 @@
         <w:t xml:space="preserve"> </w:t>
       </w:r>
       <w:r>
-        <w:t xml:space="preserve">是指数在</w:t>
+        <w:t xml:space="preserve">是指数函数在</w:t>
       </w:r>
       <w:r>
         <w:t xml:space="preserve"> </w:t>
@@ -3688,6 +3537,199 @@
         <w:pStyle w:val="FirstParagraph"/>
       </w:pPr>
       <w:r>
+        <w:t xml:space="preserve">式中，</w:t>
+      </w:r>
+      <m:oMath>
+        <m:r>
+          <m:t>k</m:t>
+        </m:r>
+      </m:oMath>
+      <w:r>
+        <w:t xml:space="preserve"> </w:t>
+      </w:r>
+      <w:r>
+        <w:t xml:space="preserve">是区间编号。</w:t>
+      </w:r>
+      <m:oMath>
+        <m:sSub>
+          <m:e>
+            <m:r>
+              <m:t>α</m:t>
+            </m:r>
+          </m:e>
+          <m:sub>
+            <m:r>
+              <m:t>k</m:t>
+            </m:r>
+          </m:sub>
+        </m:sSub>
+      </m:oMath>
+      <w:r>
+        <w:t xml:space="preserve"> </w:t>
+      </w:r>
+      <w:r>
+        <w:t xml:space="preserve">和</w:t>
+      </w:r>
+      <w:r>
+        <w:t xml:space="preserve"> </w:t>
+      </w:r>
+      <m:oMath>
+        <m:sSub>
+          <m:e>
+            <m:r>
+              <m:t>β</m:t>
+            </m:r>
+          </m:e>
+          <m:sub>
+            <m:r>
+              <m:t>k</m:t>
+            </m:r>
+          </m:sub>
+        </m:sSub>
+      </m:oMath>
+      <w:r>
+        <w:t xml:space="preserve"> </w:t>
+      </w:r>
+      <w:r>
+        <w:t xml:space="preserve">是上面两个公开系数；这个</w:t>
+      </w:r>
+      <w:r>
+        <w:t xml:space="preserve"> </w:t>
+      </w:r>
+      <m:oMath>
+        <m:sSub>
+          <m:e>
+            <m:r>
+              <m:t>β</m:t>
+            </m:r>
+          </m:e>
+          <m:sub>
+            <m:r>
+              <m:t>k</m:t>
+            </m:r>
+          </m:sub>
+        </m:sSub>
+      </m:oMath>
+      <w:r>
+        <w:t xml:space="preserve"> </w:t>
+      </w:r>
+      <w:r>
+        <w:t xml:space="preserve">不是 LayerNorm 里的</w:t>
+      </w:r>
+      <w:r>
+        <w:t xml:space="preserve"> </w:t>
+      </w:r>
+      <m:oMath>
+        <m:sSub>
+          <m:e>
+            <m:r>
+              <m:t>β</m:t>
+            </m:r>
+          </m:e>
+          <m:sub>
+            <m:r>
+              <m:t>j</m:t>
+            </m:r>
+          </m:sub>
+        </m:sSub>
+      </m:oMath>
+      <w:r>
+        <w:t xml:space="preserve">。</w:t>
+      </w:r>
+      <m:oMath>
+        <m:sSub>
+          <m:e>
+            <m:r>
+              <m:t>b</m:t>
+            </m:r>
+          </m:e>
+          <m:sub>
+            <m:r>
+              <m:t>k</m:t>
+            </m:r>
+          </m:sub>
+        </m:sSub>
+      </m:oMath>
+      <w:r>
+        <w:t xml:space="preserve"> </w:t>
+      </w:r>
+      <w:r>
+        <w:t xml:space="preserve">是秘密的区间选择位，取 0 或 1。</w:t>
+      </w:r>
+      <m:oMath>
+        <m:r>
+          <m:t>s</m:t>
+        </m:r>
+      </m:oMath>
+      <w:r>
+        <w:t xml:space="preserve"> </w:t>
+      </w:r>
+      <w:r>
+        <w:t xml:space="preserve">是一行指数的和，</w:t>
+      </w:r>
+      <m:oMath>
+        <m:sSub>
+          <m:e>
+            <m:r>
+              <m:t>r</m:t>
+            </m:r>
+          </m:e>
+          <m:sub>
+            <m:r>
+              <m:t>0</m:t>
+            </m:r>
+          </m:sub>
+        </m:sSub>
+      </m:oMath>
+      <w:r>
+        <w:t xml:space="preserve"> </w:t>
+      </w:r>
+      <w:r>
+        <w:t xml:space="preserve">是</w:t>
+      </w:r>
+      <w:r>
+        <w:t xml:space="preserve"> </w:t>
+      </w:r>
+      <m:oMath>
+        <m:r>
+          <m:t>1</m:t>
+        </m:r>
+        <m:r>
+          <m:rPr>
+            <m:sty m:val="p"/>
+          </m:rPr>
+          <m:t>/</m:t>
+        </m:r>
+        <m:r>
+          <m:t>s</m:t>
+        </m:r>
+      </m:oMath>
+      <w:r>
+        <w:t xml:space="preserve"> </w:t>
+      </w:r>
+      <w:r>
+        <w:t xml:space="preserve">的初始近似。上标</w:t>
+      </w:r>
+      <w:r>
+        <w:t xml:space="preserve"> </w:t>
+      </w:r>
+      <m:oMath>
+        <m:r>
+          <m:t>A</m:t>
+        </m:r>
+      </m:oMath>
+      <w:r>
+        <w:t xml:space="preserve"> </w:t>
+      </w:r>
+      <w:r>
+        <w:t xml:space="preserve">仍表示算术分享。</w:t>
+      </w:r>
+    </w:p>
+    <w:p>
+      <w:pPr>
+        <w:pStyle w:val="BodyText"/>
+      </w:pPr>
+      <w:r>
         <w:t xml:space="preserve">随后做两轮牛顿迭代</w:t>
       </w:r>
       <w:r>
@@ -4373,10 +4415,101 @@
         <w:pStyle w:val="FirstParagraph"/>
       </w:pPr>
       <w:r>
-        <w:t xml:space="preserve">其中</w:t>
-      </w:r>
-      <w:r>
-        <w:t xml:space="preserve"> </w:t>
+        <w:t xml:space="preserve">式中，</w:t>
+      </w:r>
+      <m:oMath>
+        <m:sSub>
+          <m:e>
+            <m:r>
+              <m:t>u</m:t>
+            </m:r>
+          </m:e>
+          <m:sub>
+            <m:r>
+              <m:t>p</m:t>
+            </m:r>
+            <m:r>
+              <m:rPr>
+                <m:sty m:val="p"/>
+              </m:rPr>
+              <m:t>,</m:t>
+            </m:r>
+            <m:r>
+              <m:t>j</m:t>
+            </m:r>
+          </m:sub>
+        </m:sSub>
+      </m:oMath>
+      <w:r>
+        <w:t xml:space="preserve"> </w:t>
+      </w:r>
+      <w:r>
+        <w:t xml:space="preserve">是位置</w:t>
+      </w:r>
+      <w:r>
+        <w:t xml:space="preserve"> </w:t>
+      </w:r>
+      <m:oMath>
+        <m:r>
+          <m:t>p</m:t>
+        </m:r>
+      </m:oMath>
+      <w:r>
+        <w:t xml:space="preserve">、第</w:t>
+      </w:r>
+      <w:r>
+        <w:t xml:space="preserve"> </w:t>
+      </w:r>
+      <m:oMath>
+        <m:r>
+          <m:t>j</m:t>
+        </m:r>
+      </m:oMath>
+      <w:r>
+        <w:t xml:space="preserve"> </w:t>
+      </w:r>
+      <w:r>
+        <w:t xml:space="preserve">维的输入。</w:t>
+      </w:r>
+      <m:oMath>
+        <m:sSub>
+          <m:e>
+            <m:r>
+              <m:t>μ</m:t>
+            </m:r>
+          </m:e>
+          <m:sub>
+            <m:r>
+              <m:t>p</m:t>
+            </m:r>
+          </m:sub>
+        </m:sSub>
+      </m:oMath>
+      <w:r>
+        <w:t xml:space="preserve"> </w:t>
+      </w:r>
+      <w:r>
+        <w:t xml:space="preserve">是这 768 个数的均值，</w:t>
+      </w:r>
+      <m:oMath>
+        <m:sSub>
+          <m:e>
+            <m:r>
+              <m:t>v</m:t>
+            </m:r>
+          </m:e>
+          <m:sub>
+            <m:r>
+              <m:t>p</m:t>
+            </m:r>
+          </m:sub>
+        </m:sSub>
+      </m:oMath>
+      <w:r>
+        <w:t xml:space="preserve"> </w:t>
+      </w:r>
+      <w:r>
+        <w:t xml:space="preserve">是方差。</w:t>
       </w:r>
       <m:oMath>
         <m:r>
@@ -4408,7 +4541,112 @@
         </m:sSup>
       </m:oMath>
       <w:r>
-        <w:t xml:space="preserve">。均值和</w:t>
+        <w:t xml:space="preserve">，用来避免分母为 0。</w:t>
+      </w:r>
+      <m:oMath>
+        <m:sSub>
+          <m:e>
+            <m:r>
+              <m:t>γ</m:t>
+            </m:r>
+          </m:e>
+          <m:sub>
+            <m:r>
+              <m:t>j</m:t>
+            </m:r>
+          </m:sub>
+        </m:sSub>
+      </m:oMath>
+      <w:r>
+        <w:t xml:space="preserve"> </w:t>
+      </w:r>
+      <w:r>
+        <w:t xml:space="preserve">是第</w:t>
+      </w:r>
+      <w:r>
+        <w:t xml:space="preserve"> </w:t>
+      </w:r>
+      <m:oMath>
+        <m:r>
+          <m:t>j</m:t>
+        </m:r>
+      </m:oMath>
+      <w:r>
+        <w:t xml:space="preserve"> </w:t>
+      </w:r>
+      <w:r>
+        <w:t xml:space="preserve">维的缩放，</w:t>
+      </w:r>
+      <m:oMath>
+        <m:sSub>
+          <m:e>
+            <m:r>
+              <m:t>β</m:t>
+            </m:r>
+          </m:e>
+          <m:sub>
+            <m:r>
+              <m:t>j</m:t>
+            </m:r>
+          </m:sub>
+        </m:sSub>
+      </m:oMath>
+      <w:r>
+        <w:t xml:space="preserve"> </w:t>
+      </w:r>
+      <w:r>
+        <w:t xml:space="preserve">是第</w:t>
+      </w:r>
+      <w:r>
+        <w:t xml:space="preserve"> </w:t>
+      </w:r>
+      <m:oMath>
+        <m:r>
+          <m:t>j</m:t>
+        </m:r>
+      </m:oMath>
+      <w:r>
+        <w:t xml:space="preserve"> </w:t>
+      </w:r>
+      <w:r>
+        <w:t xml:space="preserve">维的平移。</w:t>
+      </w:r>
+      <m:oMath>
+        <m:sSub>
+          <m:e>
+            <m:r>
+              <m:t>h</m:t>
+            </m:r>
+          </m:e>
+          <m:sub>
+            <m:r>
+              <m:t>p</m:t>
+            </m:r>
+            <m:r>
+              <m:rPr>
+                <m:sty m:val="p"/>
+              </m:rPr>
+              <m:t>,</m:t>
+            </m:r>
+            <m:r>
+              <m:t>j</m:t>
+            </m:r>
+          </m:sub>
+        </m:sSub>
+      </m:oMath>
+      <w:r>
+        <w:t xml:space="preserve"> </w:t>
+      </w:r>
+      <w:r>
+        <w:t xml:space="preserve">是归一化后的输出。</w:t>
+      </w:r>
+    </w:p>
+    <w:p>
+      <w:pPr>
+        <w:pStyle w:val="BodyText"/>
+      </w:pPr>
+      <w:r>
+        <w:t xml:space="preserve">均值和</w:t>
       </w:r>
       <w:r>
         <w:t xml:space="preserve"> </w:t>
@@ -4830,10 +5068,7 @@
         <w:pStyle w:val="FirstParagraph"/>
       </w:pPr>
       <w:r>
-        <w:t xml:space="preserve">其中</w:t>
-      </w:r>
-      <w:r>
-        <w:t xml:space="preserve"> </w:t>
+        <w:t xml:space="preserve">式中，</w:t>
       </w:r>
       <m:oMath>
         <m:r>
@@ -4895,7 +5130,7 @@
         <w:t xml:space="preserve"> </w:t>
       </w:r>
       <w:r>
-        <w:t xml:space="preserve">是注意力输出，</w:t>
+        <w:t xml:space="preserve">是注意力的输出。</w:t>
       </w:r>
       <m:oMath>
         <m:r>
@@ -4909,7 +5144,7 @@
         <w:t xml:space="preserve"> </w:t>
       </w:r>
       <w:r>
-        <w:t xml:space="preserve">是第一次 LayerNorm 之后的表示，</w:t>
+        <w:t xml:space="preserve">是第一次 LayerNorm 之后的向量，</w:t>
       </w:r>
       <m:oMath>
         <m:r>
@@ -4951,7 +5186,7 @@
         <w:t xml:space="preserve"> </w:t>
       </w:r>
       <w:r>
-        <w:t xml:space="preserve">是前馈输出，</w:t>
+        <w:t xml:space="preserve">是前馈网络的输出，</w:t>
       </w:r>
       <m:oMath>
         <m:r>
@@ -4965,7 +5200,76 @@
         <w:t xml:space="preserve"> </w:t>
       </w:r>
       <w:r>
-        <w:t xml:space="preserve">交给下一层。注意力先做联合 QKV 投影。</w:t>
+        <w:t xml:space="preserve">是本层输出，交给下一层。</w:t>
+      </w:r>
+      <m:oMath>
+        <m:sSub>
+          <m:e>
+            <m:r>
+              <m:rPr>
+                <m:sty m:val="p"/>
+              </m:rPr>
+              <m:t>L</m:t>
+            </m:r>
+            <m:r>
+              <m:rPr>
+                <m:sty m:val="p"/>
+              </m:rPr>
+              <m:t>N</m:t>
+            </m:r>
+          </m:e>
+          <m:sub>
+            <m:r>
+              <m:t>1</m:t>
+            </m:r>
+          </m:sub>
+        </m:sSub>
+      </m:oMath>
+      <w:r>
+        <w:t xml:space="preserve"> </w:t>
+      </w:r>
+      <w:r>
+        <w:t xml:space="preserve">和</w:t>
+      </w:r>
+      <w:r>
+        <w:t xml:space="preserve"> </w:t>
+      </w:r>
+      <m:oMath>
+        <m:sSub>
+          <m:e>
+            <m:r>
+              <m:rPr>
+                <m:sty m:val="p"/>
+              </m:rPr>
+              <m:t>L</m:t>
+            </m:r>
+            <m:r>
+              <m:rPr>
+                <m:sty m:val="p"/>
+              </m:rPr>
+              <m:t>N</m:t>
+            </m:r>
+          </m:e>
+          <m:sub>
+            <m:r>
+              <m:t>2</m:t>
+            </m:r>
+          </m:sub>
+        </m:sSub>
+      </m:oMath>
+      <w:r>
+        <w:t xml:space="preserve"> </w:t>
+      </w:r>
+      <w:r>
+        <w:t xml:space="preserve">是层内的两次 LayerNorm。</w:t>
+      </w:r>
+    </w:p>
+    <w:p>
+      <w:pPr>
+        <w:pStyle w:val="BodyText"/>
+      </w:pPr>
+      <w:r>
+        <w:t xml:space="preserve">注意力先做联合 QKV 投影。</w:t>
       </w:r>
       <m:oMath>
         <m:rad>
@@ -5153,6 +5457,220 @@
     <w:p>
       <w:pPr>
         <w:pStyle w:val="FirstParagraph"/>
+      </w:pPr>
+      <w:r>
+        <w:t xml:space="preserve">式中，</w:t>
+      </w:r>
+      <m:oMath>
+        <m:r>
+          <m:t>h</m:t>
+        </m:r>
+      </m:oMath>
+      <w:r>
+        <w:t xml:space="preserve"> </w:t>
+      </w:r>
+      <w:r>
+        <w:t xml:space="preserve">是头的编号，</w:t>
+      </w:r>
+      <m:oMath>
+        <m:r>
+          <m:t>q</m:t>
+        </m:r>
+      </m:oMath>
+      <w:r>
+        <w:t xml:space="preserve"> </w:t>
+      </w:r>
+      <w:r>
+        <w:t xml:space="preserve">是查询位置，</w:t>
+      </w:r>
+      <m:oMath>
+        <m:r>
+          <m:t>k</m:t>
+        </m:r>
+      </m:oMath>
+      <w:r>
+        <w:t xml:space="preserve"> </w:t>
+      </w:r>
+      <w:r>
+        <w:t xml:space="preserve">是键的位置。</w:t>
+      </w:r>
+      <m:oMath>
+        <m:sSub>
+          <m:e>
+            <m:r>
+              <m:rPr>
+                <m:sty m:val="b"/>
+              </m:rPr>
+              <m:t>q</m:t>
+            </m:r>
+          </m:e>
+          <m:sub>
+            <m:r>
+              <m:t>h</m:t>
+            </m:r>
+            <m:r>
+              <m:rPr>
+                <m:sty m:val="p"/>
+              </m:rPr>
+              <m:t>,</m:t>
+            </m:r>
+            <m:r>
+              <m:t>q</m:t>
+            </m:r>
+          </m:sub>
+        </m:sSub>
+      </m:oMath>
+      <w:r>
+        <w:t xml:space="preserve"> </w:t>
+      </w:r>
+      <w:r>
+        <w:t xml:space="preserve">是查询向量，</w:t>
+      </w:r>
+      <m:oMath>
+        <m:sSub>
+          <m:e>
+            <m:r>
+              <m:rPr>
+                <m:sty m:val="b"/>
+              </m:rPr>
+              <m:t>k</m:t>
+            </m:r>
+          </m:e>
+          <m:sub>
+            <m:r>
+              <m:t>h</m:t>
+            </m:r>
+            <m:r>
+              <m:rPr>
+                <m:sty m:val="p"/>
+              </m:rPr>
+              <m:t>,</m:t>
+            </m:r>
+            <m:r>
+              <m:t>k</m:t>
+            </m:r>
+          </m:sub>
+        </m:sSub>
+      </m:oMath>
+      <w:r>
+        <w:t xml:space="preserve"> </w:t>
+      </w:r>
+      <w:r>
+        <w:t xml:space="preserve">是键向量，上标</w:t>
+      </w:r>
+      <w:r>
+        <w:t xml:space="preserve"> </w:t>
+      </w:r>
+      <m:oMath>
+        <m:r>
+          <m:rPr>
+            <m:sty m:val="p"/>
+            <m:scr m:val="sans-serif"/>
+          </m:rPr>
+          <m:t>T</m:t>
+        </m:r>
+      </m:oMath>
+      <w:r>
+        <w:t xml:space="preserve"> </w:t>
+      </w:r>
+      <w:r>
+        <w:t xml:space="preserve">表示转置。除以 8 来自</w:t>
+      </w:r>
+      <w:r>
+        <w:t xml:space="preserve"> </w:t>
+      </w:r>
+      <m:oMath>
+        <m:rad>
+          <m:radPr>
+            <m:degHide m:val="on"/>
+          </m:radPr>
+          <m:deg/>
+          <m:e>
+            <m:r>
+              <m:t>64</m:t>
+            </m:r>
+          </m:e>
+        </m:rad>
+      </m:oMath>
+      <w:r>
+        <w:t xml:space="preserve">。</w:t>
+      </w:r>
+      <m:oMath>
+        <m:sSub>
+          <m:e>
+            <m:r>
+              <m:t>z</m:t>
+            </m:r>
+          </m:e>
+          <m:sub>
+            <m:r>
+              <m:t>h</m:t>
+            </m:r>
+            <m:r>
+              <m:rPr>
+                <m:sty m:val="p"/>
+              </m:rPr>
+              <m:t>,</m:t>
+            </m:r>
+            <m:r>
+              <m:t>q</m:t>
+            </m:r>
+            <m:r>
+              <m:rPr>
+                <m:sty m:val="p"/>
+              </m:rPr>
+              <m:t>,</m:t>
+            </m:r>
+            <m:r>
+              <m:t>k</m:t>
+            </m:r>
+          </m:sub>
+        </m:sSub>
+      </m:oMath>
+      <w:r>
+        <w:t xml:space="preserve"> </w:t>
+      </w:r>
+      <w:r>
+        <w:t xml:space="preserve">是注意力分数。</w:t>
+      </w:r>
+      <m:oMath>
+        <m:sSub>
+          <m:e>
+            <m:r>
+              <m:t>m</m:t>
+            </m:r>
+          </m:e>
+          <m:sub>
+            <m:r>
+              <m:t>k</m:t>
+            </m:r>
+          </m:sub>
+        </m:sSub>
+      </m:oMath>
+      <w:r>
+        <w:t xml:space="preserve"> </w:t>
+      </w:r>
+      <w:r>
+        <w:t xml:space="preserve">是加在第</w:t>
+      </w:r>
+      <w:r>
+        <w:t xml:space="preserve"> </w:t>
+      </w:r>
+      <m:oMath>
+        <m:r>
+          <m:t>k</m:t>
+        </m:r>
+      </m:oMath>
+      <w:r>
+        <w:t xml:space="preserve"> </w:t>
+      </w:r>
+      <w:r>
+        <w:t xml:space="preserve">个键上的掩码。</w:t>
+      </w:r>
+    </w:p>
+    <w:p>
+      <w:pPr>
+        <w:pStyle w:val="BodyText"/>
       </w:pPr>
       <m:oMath>
         <m:sSub>

</xml_diff>

<commit_message>
State the completed BERT-base Trio contribution before the operator details.
The progress section now opens with the threat model, weight sharing, and GPU matrix-multiplication path, then keeps operator derivations and the measured evidence.

Co-authored-by: Tryrail4510471 <Tryrail4510471@users.noreply.github.com>
</commit_message>
<xml_diff>
--- a/paper/midterm_section2_progress.docx
+++ b/paper/midterm_section2_progress.docx
@@ -16,7 +16,15 @@
         <w:pStyle w:val="FirstParagraph"/>
       </w:pPr>
       <w:r>
-        <w:t xml:space="preserve">研究按「先实现算子，再逐级拼成 BERT-base，最后用实验逐级论证」推进。公开 BERT-base 的前向被拆成输入嵌入、私有矩阵乘、Softmax、GELU、LayerNorm，再由这些算子组成注意力、前馈网络、Pooler 和分类头。三台 NVIDIA A10 上使用 hpmpc 的 Trio 半诚实三方协议。权重保持为算术分享，token 编号和 padding 掩码对三方公开，中间激活不还原，最后只揭示两个 logit。下面先说明各算子的实现，再按同一顺序给出实验结果。每条公式下面解释该式中的字母。</w:t>
+        <w:t xml:space="preserve">为了提高 Transformer 隐私推理的效率，本工作选用 BERT-base 作为基础模型，在 hpmpc 上设计了 Trio 三方协议与 GPU 矩阵乘库相结合的实现。模型参数规模足够大时，由 GPU 承担矩阵乘中的本地整数积，相对纯 CPU 上逐元素点积的计算框架，能够提高这一部分的吞吐。安全模型是三方半诚实：最多一方被腐蚀，且被腐蚀方不与其他方串谋。一方持有模型权重，在使用这些参数之前把它们秘密分享给三方。此后每一方只持有自己的份额，任何单方都不能单独还原权重。token 编号和 padding 掩码对三方公开，中间激活保持为分享，最后只揭示两个 logit。</w:t>
+      </w:r>
+    </w:p>
+    <w:p>
+      <w:pPr>
+        <w:pStyle w:val="BodyText"/>
+      </w:pPr>
+      <w:r>
+        <w:t xml:space="preserve">已经完成的主要工作有四部分。第一，把 BERT-base 的 eval 前向落到 Trio 上，包括输入嵌入、私有矩阵乘、Softmax、GELU、LayerNorm，以及由它们组成的注意力、前馈网络、Pooler 和分类头。第二，矩阵乘采用 10 比特 limb，使 Q12.20 乘法能留在 32 位环内，并把本地整数积接到已有的 CUDA 矩阵乘库。第三，针对 28 GiB 内存，采用单进程、逐层分享和释放，使 12 层私有权重能够在三台 A10 上跑完。第四，在真实三机上按算子、单层和 12 层逐级测量误差，说明这条数值路径已经闭合。下面先写各算子的实现，再按同一顺序给出实验。每条公式下面解释该式中的字母。</w:t>
       </w:r>
     </w:p>
     <w:bookmarkStart w:id="27" w:name="一各算子的实现方式"/>
@@ -118,7 +126,7 @@
         <w:t xml:space="preserve"> </w:t>
       </w:r>
       <w:r>
-        <w:t xml:space="preserve">持有明文权重，</w:t>
+        <w:t xml:space="preserve">持有明文权重并负责分享，</w:t>
       </w:r>
       <m:oMath>
         <m:sSub>
@@ -138,7 +146,27 @@
         <w:t xml:space="preserve"> </w:t>
       </w:r>
       <w:r>
-        <w:t xml:space="preserve">提供公开的 token 输入。算术分享记为</w:t>
+        <w:t xml:space="preserve">提供公开的 token 输入，</w:t>
+      </w:r>
+      <m:oMath>
+        <m:sSub>
+          <m:e>
+            <m:r>
+              <m:t>P</m:t>
+            </m:r>
+          </m:e>
+          <m:sub>
+            <m:r>
+              <m:t>2</m:t>
+            </m:r>
+          </m:sub>
+        </m:sSub>
+      </m:oMath>
+      <w:r>
+        <w:t xml:space="preserve"> </w:t>
+      </w:r>
+      <w:r>
+        <w:t xml:space="preserve">参与协议计算。算术分享记为</w:t>
       </w:r>
       <w:r>
         <w:t xml:space="preserve"> </w:t>
@@ -5896,7 +5924,7 @@
         <w:pStyle w:val="FirstParagraph"/>
       </w:pPr>
       <w:r>
-        <w:t xml:space="preserve">实验与上一节的算子顺序一致。比较对象是同一套 Q12.20 量化后的明文参考，指标是重构值与参考值的绝对误差。三机均为 NVIDIA A10，内网约 15 Gbps，日期在 2026 年 7 月。</w:t>
+        <w:t xml:space="preserve">实验用来论证上一节的实现确实算出了 BERT-base，而不是重复叙述方法。比较对象是同一套 Q12.20 量化后的明文参考，指标是重构值与参考值的绝对误差。三机均为 NVIDIA A10，内网约 15 Gbps，日期在 2026 年 7 月。矩阵乘走 GPU 库；本节列出的是正确性结果。BERT-base 上 GPU 与纯 CPU 的同形状吞吐对照还没有作为下面的数据。</w:t>
       </w:r>
     </w:p>
     <w:p>

</xml_diff>

<commit_message>
Frame the progress section as a GPU-accelerated private Transformer method.
The opening now states the missing BERT-base path, the Trio-and-GPU method, and the measured end-to-end agreement before the operator details.

Co-authored-by: Tryrail4510471 <Tryrail4510471@users.noreply.github.com>
</commit_message>
<xml_diff>
--- a/paper/midterm_section2_progress.docx
+++ b/paper/midterm_section2_progress.docx
@@ -16,7 +16,7 @@
         <w:pStyle w:val="FirstParagraph"/>
       </w:pPr>
       <w:r>
-        <w:t xml:space="preserve">为了提高 Transformer 隐私推理的效率，本工作选用 BERT-base 作为基础模型，在 hpmpc 上设计了 Trio 三方协议与 GPU 矩阵乘库相结合的实现。模型参数规模足够大时，由 GPU 承担矩阵乘中的本地整数积，相对纯 CPU 上逐元素点积的计算框架，能够提高这一部分的吞吐。安全模型是三方半诚实：最多一方被腐蚀，且被腐蚀方不与其他方串谋。一方持有模型权重，在使用这些参数之前把它们秘密分享给三方。此后每一方只持有自己的份额，任何单方都不能单独还原权重。token 编号和 padding 掩码对三方公开，中间激活保持为分享，最后只揭示两个 logit。</w:t>
+        <w:t xml:space="preserve">Transformer 的隐私推理里，模型权重不能交给任何一方单独看见，矩阵乘又构成主要计算量。hpmpc 的 Trio 已经能完成半诚实三方计算，GPU 库也已经能完成大矩阵的本地整数乘。缺的是一套能放进 32 位 Q12.20、并且 12 层都能在约 28 GiB 内存里跑完的 BERT-base 前向。</w:t>
       </w:r>
     </w:p>
     <w:p>
@@ -24,7 +24,15 @@
         <w:pStyle w:val="BodyText"/>
       </w:pPr>
       <w:r>
-        <w:t xml:space="preserve">已经完成的主要工作有四部分。第一，把 BERT-base 的 eval 前向落到 Trio 上，包括输入嵌入、私有矩阵乘、Softmax、GELU、LayerNorm，以及由它们组成的注意力、前馈网络、Pooler 和分类头。第二，矩阵乘采用 10 比特 limb，使 Q12.20 乘法能留在 32 位环内，并把本地整数积接到已有的 CUDA 矩阵乘库。第三，针对 28 GiB 内存，采用单进程、逐层分享和释放，使 12 层私有权重能够在三台 A10 上跑完。第四，在真实三机上按算子、单层和 12 层逐级测量误差，说明这条数值路径已经闭合。下面先写各算子的实现，再按同一顺序给出实验。每条公式下面解释该式中的字母。</w:t>
+        <w:t xml:space="preserve">针对这一缺口，本文提出一种 GPU 加速的 Transformer 隐私推理方法，并以 BERT-base 作为实现对象。安全模型是三方半诚实：最多一方被腐蚀，且各方不串谋。持有权重的一方在使用参数之前把权重秘密分享给三方，此后任何单方都无法还原权重。线性层把 Q12.20 乘法拆成 10 比特 limb，本地整数积交给已有的 GPU 矩阵乘；Softmax、GELU 和 LayerNorm 改写成算术分享上的截断乘法，以及少量布尔比较。内存一次放不下 12 层私有权重时，就一层分享、计算、释放。token 编号和 padding 掩码对三方公开，中间激活保持为分享，最后只揭示两个 logit。</w:t>
+      </w:r>
+    </w:p>
+    <w:p>
+      <w:pPr>
+        <w:pStyle w:val="BodyText"/>
+      </w:pPr>
+      <w:r>
+        <w:t xml:space="preserve">三机实验看到的是这条链路已经算对。算子误差逐级变大，到 12 层时 MRPC 和 RTE 的预测类别仍与明文一致。下面先写各算子怎么实现，再按同一顺序给出这些误差。每条公式下面解释该式中的字母。</w:t>
       </w:r>
     </w:p>
     <w:bookmarkStart w:id="27" w:name="一各算子的实现方式"/>
@@ -5924,7 +5932,7 @@
         <w:pStyle w:val="FirstParagraph"/>
       </w:pPr>
       <w:r>
-        <w:t xml:space="preserve">实验用来论证上一节的实现确实算出了 BERT-base，而不是重复叙述方法。比较对象是同一套 Q12.20 量化后的明文参考，指标是重构值与参考值的绝对误差。三机均为 NVIDIA A10，内网约 15 Gbps，日期在 2026 年 7 月。矩阵乘走 GPU 库；本节列出的是正确性结果。BERT-base 上 GPU 与纯 CPU 的同形状吞吐对照还没有作为下面的数据。</w:t>
+        <w:t xml:space="preserve">实验按上一节的算子顺序排列，用来说明 GPU 加速的这条隐私推理链路在数值上已经闭合。比较对象是同一套 Q12.20 量化后的明文参考，指标是重构值与参考值的绝对误差。三机均为 NVIDIA A10，内网约 15 Gbps，矩阵乘的本地整数积走 GPU 库，日期在 2026 年 7 月。</w:t>
       </w:r>
     </w:p>
     <w:p>

</xml_diff>